<commit_message>
progress in pkt 2 still have BIG problem
</commit_message>
<xml_diff>
--- a/Lab3/LELA1_LAB3_Rah_Sal.docx
+++ b/Lab3/LELA1_LAB3_Rah_Sal.docx
@@ -85,12 +85,6 @@
         <w:gridCol w:w="3064"/>
       </w:tblGrid>
       <w:tr>
-        <w:tblPrEx>
-          <w:tblCellMar>
-            <w:top w:w="0" w:type="dxa"/>
-            <w:bottom w:w="0" w:type="dxa"/>
-          </w:tblCellMar>
-        </w:tblPrEx>
         <w:tc>
           <w:tcPr>
             <w:tcW w:w="2499" w:type="dxa"/>
@@ -216,12 +210,6 @@
         </w:tc>
       </w:tr>
       <w:tr>
-        <w:tblPrEx>
-          <w:tblCellMar>
-            <w:top w:w="0" w:type="dxa"/>
-            <w:bottom w:w="0" w:type="dxa"/>
-          </w:tblCellMar>
-        </w:tblPrEx>
         <w:tc>
           <w:tcPr>
             <w:tcW w:w="9643" w:type="dxa"/>
@@ -283,12 +271,6 @@
         </w:tc>
       </w:tr>
       <w:tr>
-        <w:tblPrEx>
-          <w:tblCellMar>
-            <w:top w:w="0" w:type="dxa"/>
-            <w:bottom w:w="0" w:type="dxa"/>
-          </w:tblCellMar>
-        </w:tblPrEx>
         <w:tc>
           <w:tcPr>
             <w:tcW w:w="3686" w:type="dxa"/>
@@ -459,12 +441,6 @@
         </w:tc>
       </w:tr>
       <w:tr>
-        <w:tblPrEx>
-          <w:tblCellMar>
-            <w:top w:w="0" w:type="dxa"/>
-            <w:bottom w:w="0" w:type="dxa"/>
-          </w:tblCellMar>
-        </w:tblPrEx>
         <w:tc>
           <w:tcPr>
             <w:tcW w:w="3686" w:type="dxa"/>
@@ -594,12 +570,6 @@
         </w:tc>
       </w:tr>
       <w:tr>
-        <w:tblPrEx>
-          <w:tblCellMar>
-            <w:top w:w="0" w:type="dxa"/>
-            <w:bottom w:w="0" w:type="dxa"/>
-          </w:tblCellMar>
-        </w:tblPrEx>
         <w:tc>
           <w:tcPr>
             <w:tcW w:w="3686" w:type="dxa"/>
@@ -695,12 +665,6 @@
         </w:tc>
       </w:tr>
       <w:tr>
-        <w:tblPrEx>
-          <w:tblCellMar>
-            <w:top w:w="0" w:type="dxa"/>
-            <w:bottom w:w="0" w:type="dxa"/>
-          </w:tblCellMar>
-        </w:tblPrEx>
         <w:tc>
           <w:tcPr>
             <w:tcW w:w="5100" w:type="dxa"/>
@@ -818,12 +782,6 @@
         <w:gridCol w:w="1119"/>
       </w:tblGrid>
       <w:tr>
-        <w:tblPrEx>
-          <w:tblCellMar>
-            <w:top w:w="0" w:type="dxa"/>
-            <w:bottom w:w="0" w:type="dxa"/>
-          </w:tblCellMar>
-        </w:tblPrEx>
         <w:trPr>
           <w:cantSplit/>
         </w:trPr>
@@ -1103,12 +1061,6 @@
         </w:tc>
       </w:tr>
       <w:tr>
-        <w:tblPrEx>
-          <w:tblCellMar>
-            <w:top w:w="0" w:type="dxa"/>
-            <w:bottom w:w="0" w:type="dxa"/>
-          </w:tblCellMar>
-        </w:tblPrEx>
         <w:trPr>
           <w:cantSplit/>
         </w:trPr>
@@ -1533,6 +1485,8 @@
           <w:rFonts w:ascii="Calibri" w:hAnsi="Calibri"/>
           <w:b/>
           <w:bCs/>
+          <w:noProof/>
+          <w:lang w:val="ru-RU" w:eastAsia="ru-RU" w:bidi="ar-SA"/>
         </w:rPr>
         <w:drawing>
           <wp:inline distT="0" distB="0" distL="0" distR="0" wp14:anchorId="641738E7" wp14:editId="06F59F1B">
@@ -2019,13 +1973,7 @@
             <w:rPr>
               <w:rFonts w:ascii="Cambria Math" w:hAnsi="Cambria Math" w:cstheme="minorHAnsi"/>
             </w:rPr>
-            <m:t>=</m:t>
-          </m:r>
-          <m:r>
-            <w:rPr>
-              <w:rFonts w:ascii="Cambria Math" w:hAnsi="Cambria Math" w:cstheme="minorHAnsi"/>
-            </w:rPr>
-            <m:t>GND-</m:t>
+            <m:t>=GND-</m:t>
           </m:r>
           <m:sSub>
             <m:sSubPr>
@@ -2057,37 +2005,7 @@
             <w:rPr>
               <w:rFonts w:ascii="Cambria Math" w:hAnsi="Cambria Math" w:cstheme="minorHAnsi"/>
             </w:rPr>
-            <m:t> =</m:t>
-          </m:r>
-          <m:r>
-            <w:rPr>
-              <w:rFonts w:ascii="Cambria Math" w:hAnsi="Cambria Math" w:cstheme="minorHAnsi"/>
-            </w:rPr>
-            <m:t>0 V</m:t>
-          </m:r>
-          <m:r>
-            <w:rPr>
-              <w:rFonts w:ascii="Cambria Math" w:hAnsi="Cambria Math" w:cstheme="minorHAnsi"/>
-            </w:rPr>
-            <m:t xml:space="preserve">- </m:t>
-          </m:r>
-          <m:r>
-            <w:rPr>
-              <w:rFonts w:ascii="Cambria Math" w:hAnsi="Cambria Math" w:cstheme="minorHAnsi"/>
-            </w:rPr>
-            <m:t>1,52</m:t>
-          </m:r>
-          <m:r>
-            <w:rPr>
-              <w:rFonts w:ascii="Cambria Math" w:hAnsi="Cambria Math" w:cstheme="minorHAnsi"/>
-            </w:rPr>
-            <m:t xml:space="preserve"> V</m:t>
-          </m:r>
-          <m:r>
-            <w:rPr>
-              <w:rFonts w:ascii="Cambria Math" w:hAnsi="Cambria Math" w:cstheme="minorHAnsi"/>
-            </w:rPr>
-            <m:t>=-1,52 V</m:t>
+            <m:t> =0 V- 1,52 V=-1,52 V</m:t>
           </m:r>
         </m:oMath>
       </m:oMathPara>
@@ -2208,19 +2126,7 @@
             <w:rPr>
               <w:rFonts w:ascii="Cambria Math" w:hAnsi="Cambria Math" w:cstheme="minorHAnsi"/>
             </w:rPr>
-            <m:t xml:space="preserve"> = -9</m:t>
-          </m:r>
-          <m:r>
-            <w:rPr>
-              <w:rFonts w:ascii="Cambria Math" w:hAnsi="Cambria Math" w:cstheme="minorHAnsi"/>
-            </w:rPr>
-            <m:t>,00 V+</m:t>
-          </m:r>
-          <m:r>
-            <w:rPr>
-              <w:rFonts w:ascii="Cambria Math" w:hAnsi="Cambria Math" w:cstheme="minorHAnsi"/>
-            </w:rPr>
-            <m:t>6</m:t>
+            <m:t xml:space="preserve"> = -9,00 V+6</m:t>
           </m:r>
           <m:r>
             <w:rPr>
@@ -2233,19 +2139,7 @@
             <w:rPr>
               <w:rFonts w:ascii="Cambria Math" w:hAnsi="Cambria Math" w:cstheme="minorHAnsi"/>
             </w:rPr>
-            <m:t xml:space="preserve"> V</m:t>
-          </m:r>
-          <m:r>
-            <w:rPr>
-              <w:rFonts w:ascii="Cambria Math" w:hAnsi="Cambria Math" w:cstheme="minorHAnsi"/>
-            </w:rPr>
-            <m:t xml:space="preserve"> =- 2,28</m:t>
-          </m:r>
-          <m:r>
-            <w:rPr>
-              <w:rFonts w:ascii="Cambria Math" w:hAnsi="Cambria Math" w:cstheme="minorHAnsi"/>
-            </w:rPr>
-            <m:t xml:space="preserve"> V</m:t>
+            <m:t xml:space="preserve"> V =- 2,28 V</m:t>
           </m:r>
         </m:oMath>
       </m:oMathPara>
@@ -2378,13 +2272,7 @@
             <w:rPr>
               <w:rFonts w:ascii="Cambria Math" w:hAnsi="Cambria Math" w:cstheme="minorHAnsi"/>
             </w:rPr>
-            <m:t>=-1,52</m:t>
-          </m:r>
-          <m:r>
-            <w:rPr>
-              <w:rFonts w:ascii="Cambria Math" w:hAnsi="Cambria Math" w:cstheme="minorHAnsi"/>
-            </w:rPr>
-            <m:t xml:space="preserve"> V -</m:t>
+            <m:t>=-1,52 V -</m:t>
           </m:r>
           <m:d>
             <m:dPr>
@@ -2400,19 +2288,7 @@
                 <w:rPr>
                   <w:rFonts w:ascii="Cambria Math" w:hAnsi="Cambria Math" w:cstheme="minorHAnsi"/>
                 </w:rPr>
-                <m:t>-</m:t>
-              </m:r>
-              <m:r>
-                <w:rPr>
-                  <w:rFonts w:ascii="Cambria Math" w:hAnsi="Cambria Math" w:cstheme="minorHAnsi"/>
-                </w:rPr>
-                <m:t>2,28</m:t>
-              </m:r>
-              <m:r>
-                <w:rPr>
-                  <w:rFonts w:ascii="Cambria Math" w:hAnsi="Cambria Math" w:cstheme="minorHAnsi"/>
-                </w:rPr>
-                <m:t xml:space="preserve"> V</m:t>
+                <m:t>-2,28 V</m:t>
               </m:r>
             </m:e>
           </m:d>
@@ -2420,13 +2296,7 @@
             <w:rPr>
               <w:rFonts w:ascii="Cambria Math" w:hAnsi="Cambria Math" w:cstheme="minorHAnsi"/>
             </w:rPr>
-            <m:t>=0,76</m:t>
-          </m:r>
-          <m:r>
-            <w:rPr>
-              <w:rFonts w:ascii="Cambria Math" w:hAnsi="Cambria Math" w:cstheme="minorHAnsi"/>
-            </w:rPr>
-            <m:t> V</m:t>
+            <m:t>=0,76 V</m:t>
           </m:r>
         </m:oMath>
       </m:oMathPara>
@@ -2581,13 +2451,7 @@
                     <w:rPr>
                       <w:rFonts w:ascii="Cambria Math" w:hAnsi="Cambria Math" w:cstheme="minorHAnsi"/>
                     </w:rPr>
-                    <m:t>R</m:t>
-                  </m:r>
-                  <m:r>
-                    <w:rPr>
-                      <w:rFonts w:ascii="Cambria Math" w:hAnsi="Cambria Math" w:cstheme="minorHAnsi"/>
-                    </w:rPr>
-                    <m:t>4</m:t>
+                    <m:t>R4</m:t>
                   </m:r>
                 </m:sub>
               </m:sSub>
@@ -2641,13 +2505,7 @@
                 <w:rPr>
                   <w:rFonts w:ascii="Cambria Math" w:hAnsi="Cambria Math" w:cstheme="minorHAnsi"/>
                 </w:rPr>
-                <m:t>6,72</m:t>
-              </m:r>
-              <m:r>
-                <w:rPr>
-                  <w:rFonts w:ascii="Cambria Math" w:hAnsi="Cambria Math" w:cstheme="minorHAnsi"/>
-                </w:rPr>
-                <m:t xml:space="preserve"> V</m:t>
+                <m:t>6,72 V</m:t>
               </m:r>
             </m:num>
             <m:den>
@@ -2655,13 +2513,7 @@
                 <w:rPr>
                   <w:rFonts w:ascii="Cambria Math" w:hAnsi="Cambria Math" w:cstheme="minorHAnsi"/>
                 </w:rPr>
-                <m:t>1,3</m:t>
-              </m:r>
-              <m:r>
-                <w:rPr>
-                  <w:rFonts w:ascii="Cambria Math" w:hAnsi="Cambria Math" w:cstheme="minorHAnsi"/>
-                </w:rPr>
-                <m:t>0 kΩ</m:t>
+                <m:t>1,30 kΩ</m:t>
               </m:r>
             </m:den>
           </m:f>
@@ -2669,13 +2521,7 @@
             <w:rPr>
               <w:rFonts w:ascii="Cambria Math" w:hAnsi="Cambria Math" w:cstheme="minorHAnsi"/>
             </w:rPr>
-            <m:t xml:space="preserve"> =  5,16</m:t>
-          </m:r>
-          <m:r>
-            <w:rPr>
-              <w:rFonts w:ascii="Cambria Math" w:hAnsi="Cambria Math" w:cstheme="minorHAnsi"/>
-            </w:rPr>
-            <m:t xml:space="preserve"> mA</m:t>
+            <m:t xml:space="preserve"> =  5,16 mA</m:t>
           </m:r>
         </m:oMath>
       </m:oMathPara>
@@ -2996,13 +2842,7 @@
             <w:rPr>
               <w:rFonts w:ascii="Cambria Math" w:hAnsi="Cambria Math" w:cstheme="minorHAnsi"/>
             </w:rPr>
-            <m:t xml:space="preserve"> =  132,4</m:t>
-          </m:r>
-          <m:r>
-            <w:rPr>
-              <w:rFonts w:ascii="Cambria Math" w:hAnsi="Cambria Math" w:cstheme="minorHAnsi"/>
-            </w:rPr>
-            <m:t>1</m:t>
+            <m:t xml:space="preserve"> =  132,41</m:t>
           </m:r>
           <m:f>
             <m:fPr>
@@ -3259,13 +3099,7 @@
             <w:rPr>
               <w:rFonts w:ascii="Cambria Math" w:hAnsi="Cambria Math" w:cstheme="minorHAnsi"/>
             </w:rPr>
-            <m:t>+</m:t>
-          </m:r>
-          <m:r>
-            <w:rPr>
-              <w:rFonts w:ascii="Cambria Math" w:hAnsi="Cambria Math" w:cstheme="minorHAnsi"/>
-            </w:rPr>
-            <m:t xml:space="preserve"> </m:t>
+            <m:t xml:space="preserve">+ </m:t>
           </m:r>
           <m:sSub>
             <m:sSubPr>
@@ -3492,8 +3326,34 @@
             <w:rPr>
               <w:rFonts w:ascii="Cambria Math" w:hAnsi="Cambria Math" w:cstheme="minorHAnsi"/>
             </w:rPr>
-            <m:t>∙R2</m:t>
+            <m:t>∙</m:t>
           </m:r>
+          <m:sSub>
+            <m:sSubPr>
+              <m:ctrlPr>
+                <w:rPr>
+                  <w:rFonts w:ascii="Cambria Math" w:hAnsi="Cambria Math" w:cstheme="minorHAnsi"/>
+                  <w:i/>
+                </w:rPr>
+              </m:ctrlPr>
+            </m:sSubPr>
+            <m:e>
+              <m:r>
+                <w:rPr>
+                  <w:rFonts w:ascii="Cambria Math" w:hAnsi="Cambria Math" w:cstheme="minorHAnsi"/>
+                </w:rPr>
+                <m:t>R</m:t>
+              </m:r>
+            </m:e>
+            <m:sub>
+              <m:r>
+                <w:rPr>
+                  <w:rFonts w:ascii="Cambria Math" w:hAnsi="Cambria Math" w:cstheme="minorHAnsi"/>
+                </w:rPr>
+                <m:t>2</m:t>
+              </m:r>
+            </m:sub>
+          </m:sSub>
           <m:r>
             <w:rPr>
               <w:rFonts w:ascii="Cambria Math" w:hAnsi="Cambria Math" w:cstheme="minorHAnsi"/>
@@ -3558,19 +3418,7 @@
             <w:rPr>
               <w:rFonts w:ascii="Cambria Math" w:hAnsi="Cambria Math" w:cstheme="minorHAnsi"/>
             </w:rPr>
-            <m:t>+</m:t>
-          </m:r>
-          <m:r>
-            <w:rPr>
-              <w:rFonts w:ascii="Cambria Math" w:hAnsi="Cambria Math" w:cstheme="minorHAnsi"/>
-            </w:rPr>
-            <m:t>β</m:t>
-          </m:r>
-          <m:r>
-            <w:rPr>
-              <w:rFonts w:ascii="Cambria Math" w:hAnsi="Cambria Math" w:cstheme="minorHAnsi"/>
-            </w:rPr>
-            <m:t>∙</m:t>
+            <m:t>+β∙</m:t>
           </m:r>
           <m:sSub>
             <m:sSubPr>
@@ -3624,13 +3472,7 @@
             <w:rPr>
               <w:rFonts w:ascii="Cambria Math" w:hAnsi="Cambria Math" w:cstheme="minorHAnsi"/>
             </w:rPr>
-            <m:t>∙R4</m:t>
-          </m:r>
-          <m:r>
-            <w:rPr>
-              <w:rFonts w:ascii="Cambria Math" w:hAnsi="Cambria Math" w:cstheme="minorHAnsi"/>
-            </w:rPr>
-            <m:t>+</m:t>
+            <m:t>∙R4+</m:t>
           </m:r>
           <m:sSub>
             <m:sSubPr>
@@ -3792,13 +3634,7 @@
                 <w:rPr>
                   <w:rFonts w:ascii="Cambria Math" w:hAnsi="Cambria Math" w:cstheme="minorHAnsi"/>
                 </w:rPr>
-                <m:t>-</m:t>
-              </m:r>
-              <m:r>
-                <w:rPr>
-                  <w:rFonts w:ascii="Cambria Math" w:hAnsi="Cambria Math" w:cstheme="minorHAnsi"/>
-                </w:rPr>
-                <m:t xml:space="preserve"> </m:t>
+                <m:t xml:space="preserve">- </m:t>
               </m:r>
               <m:sSub>
                 <m:sSubPr>
@@ -3887,26 +3723,34 @@
                 <w:rPr>
                   <w:rFonts w:ascii="Cambria Math" w:hAnsi="Cambria Math" w:cstheme="minorHAnsi"/>
                 </w:rPr>
-                <m:t>+</m:t>
+                <m:t xml:space="preserve">+ β ∙ </m:t>
               </m:r>
-              <m:r>
-                <w:rPr>
-                  <w:rFonts w:ascii="Cambria Math" w:hAnsi="Cambria Math" w:cstheme="minorHAnsi"/>
-                </w:rPr>
-                <m:t xml:space="preserve"> β</m:t>
-              </m:r>
-              <m:r>
-                <w:rPr>
-                  <w:rFonts w:ascii="Cambria Math" w:hAnsi="Cambria Math" w:cstheme="minorHAnsi"/>
-                </w:rPr>
-                <m:t xml:space="preserve"> ∙</m:t>
-              </m:r>
-              <m:r>
-                <w:rPr>
-                  <w:rFonts w:ascii="Cambria Math" w:hAnsi="Cambria Math" w:cstheme="minorHAnsi"/>
-                </w:rPr>
-                <m:t xml:space="preserve"> R4</m:t>
-              </m:r>
+              <m:sSub>
+                <m:sSubPr>
+                  <m:ctrlPr>
+                    <w:rPr>
+                      <w:rFonts w:ascii="Cambria Math" w:hAnsi="Cambria Math" w:cstheme="minorHAnsi"/>
+                      <w:i/>
+                    </w:rPr>
+                  </m:ctrlPr>
+                </m:sSubPr>
+                <m:e>
+                  <m:r>
+                    <w:rPr>
+                      <w:rFonts w:ascii="Cambria Math" w:hAnsi="Cambria Math" w:cstheme="minorHAnsi"/>
+                    </w:rPr>
+                    <m:t>R</m:t>
+                  </m:r>
+                </m:e>
+                <m:sub>
+                  <m:r>
+                    <w:rPr>
+                      <w:rFonts w:ascii="Cambria Math" w:hAnsi="Cambria Math" w:cstheme="minorHAnsi"/>
+                    </w:rPr>
+                    <m:t>4</m:t>
+                  </m:r>
+                </m:sub>
+              </m:sSub>
             </m:den>
           </m:f>
           <m:r>
@@ -3930,25 +3774,7 @@
                 <w:rPr>
                   <w:rFonts w:ascii="Cambria Math" w:hAnsi="Cambria Math" w:cstheme="minorHAnsi"/>
                 </w:rPr>
-                <m:t>-(</m:t>
-              </m:r>
-              <m:r>
-                <w:rPr>
-                  <w:rFonts w:ascii="Cambria Math" w:hAnsi="Cambria Math" w:cstheme="minorHAnsi"/>
-                </w:rPr>
-                <m:t>-9,00 V</m:t>
-              </m:r>
-              <m:r>
-                <w:rPr>
-                  <w:rFonts w:ascii="Cambria Math" w:hAnsi="Cambria Math" w:cstheme="minorHAnsi"/>
-                </w:rPr>
-                <m:t>)-</m:t>
-              </m:r>
-              <m:r>
-                <w:rPr>
-                  <w:rFonts w:ascii="Cambria Math" w:hAnsi="Cambria Math" w:cstheme="minorHAnsi"/>
-                </w:rPr>
-                <m:t>0,70 V</m:t>
+                <m:t>-(-9,00 V)-0,70 V</m:t>
               </m:r>
             </m:num>
             <m:den>
@@ -3956,25 +3782,7 @@
                 <w:rPr>
                   <w:rFonts w:ascii="Cambria Math" w:hAnsi="Cambria Math" w:cstheme="minorHAnsi"/>
                 </w:rPr>
-                <m:t>39,00kΩ</m:t>
-              </m:r>
-              <m:r>
-                <w:rPr>
-                  <w:rFonts w:ascii="Cambria Math" w:hAnsi="Cambria Math" w:cstheme="minorHAnsi"/>
-                </w:rPr>
-                <m:t>+</m:t>
-              </m:r>
-              <m:r>
-                <w:rPr>
-                  <w:rFonts w:ascii="Cambria Math" w:hAnsi="Cambria Math" w:cstheme="minorHAnsi"/>
-                </w:rPr>
-                <m:t>132,4</m:t>
-              </m:r>
-              <m:r>
-                <w:rPr>
-                  <w:rFonts w:ascii="Cambria Math" w:hAnsi="Cambria Math" w:cstheme="minorHAnsi"/>
-                </w:rPr>
-                <m:t>1</m:t>
+                <m:t>39,00kΩ+132,41</m:t>
               </m:r>
               <m:f>
                 <m:fPr>
@@ -4015,25 +3823,7 @@
             <w:rPr>
               <w:rFonts w:ascii="Cambria Math" w:hAnsi="Cambria Math" w:cstheme="minorHAnsi"/>
             </w:rPr>
-            <m:t>=</m:t>
-          </m:r>
-          <m:r>
-            <w:rPr>
-              <w:rFonts w:ascii="Cambria Math" w:hAnsi="Cambria Math" w:cstheme="minorHAnsi"/>
-            </w:rPr>
-            <m:t>39,31</m:t>
-          </m:r>
-          <m:r>
-            <w:rPr>
-              <w:rFonts w:ascii="Cambria Math" w:hAnsi="Cambria Math" w:cstheme="minorHAnsi"/>
-            </w:rPr>
-            <m:t xml:space="preserve"> </m:t>
-          </m:r>
-          <m:r>
-            <w:rPr>
-              <w:rFonts w:ascii="Cambria Math" w:hAnsi="Cambria Math" w:cstheme="minorHAnsi"/>
-            </w:rPr>
-            <m:t>µA</m:t>
+            <m:t>=39,31 µA</m:t>
           </m:r>
         </m:oMath>
       </m:oMathPara>
@@ -4219,19 +4009,7 @@
             <w:rPr>
               <w:rFonts w:ascii="Cambria Math" w:hAnsi="Cambria Math" w:cstheme="minorHAnsi"/>
             </w:rPr>
-            <m:t xml:space="preserve">=132,41∙39,31 </m:t>
-          </m:r>
-          <m:r>
-            <w:rPr>
-              <w:rFonts w:ascii="Cambria Math" w:hAnsi="Cambria Math" w:cstheme="minorHAnsi"/>
-            </w:rPr>
-            <m:t>µA</m:t>
-          </m:r>
-          <m:r>
-            <w:rPr>
-              <w:rFonts w:ascii="Cambria Math" w:hAnsi="Cambria Math" w:cstheme="minorHAnsi"/>
-            </w:rPr>
-            <m:t>=5,21 mA</m:t>
+            <m:t>=132,41∙39,31 µA=5,21 mA</m:t>
           </m:r>
         </m:oMath>
       </m:oMathPara>
@@ -4315,7 +4093,39 @@
             <w:rPr>
               <w:rFonts w:ascii="Cambria Math" w:hAnsi="Cambria Math" w:cstheme="minorHAnsi"/>
             </w:rPr>
-            <m:t>=R4∙</m:t>
+            <m:t>=</m:t>
+          </m:r>
+          <m:sSub>
+            <m:sSubPr>
+              <m:ctrlPr>
+                <w:rPr>
+                  <w:rFonts w:ascii="Cambria Math" w:hAnsi="Cambria Math" w:cstheme="minorHAnsi"/>
+                  <w:i/>
+                </w:rPr>
+              </m:ctrlPr>
+            </m:sSubPr>
+            <m:e>
+              <m:r>
+                <w:rPr>
+                  <w:rFonts w:ascii="Cambria Math" w:hAnsi="Cambria Math" w:cstheme="minorHAnsi"/>
+                </w:rPr>
+                <m:t>R</m:t>
+              </m:r>
+            </m:e>
+            <m:sub>
+              <m:r>
+                <w:rPr>
+                  <w:rFonts w:ascii="Cambria Math" w:hAnsi="Cambria Math" w:cstheme="minorHAnsi"/>
+                </w:rPr>
+                <m:t>4</m:t>
+              </m:r>
+            </m:sub>
+          </m:sSub>
+          <m:r>
+            <w:rPr>
+              <w:rFonts w:ascii="Cambria Math" w:hAnsi="Cambria Math" w:cstheme="minorHAnsi"/>
+            </w:rPr>
+            <m:t>∙</m:t>
           </m:r>
           <m:sSub>
             <m:sSubPr>
@@ -4369,37 +4179,7 @@
             <w:rPr>
               <w:rFonts w:ascii="Cambria Math" w:hAnsi="Cambria Math" w:cstheme="minorHAnsi"/>
             </w:rPr>
-            <m:t>=</m:t>
-          </m:r>
-          <m:r>
-            <w:rPr>
-              <w:rFonts w:ascii="Cambria Math" w:hAnsi="Cambria Math" w:cstheme="minorHAnsi"/>
-            </w:rPr>
-            <m:t>1,30</m:t>
-          </m:r>
-          <m:r>
-            <w:rPr>
-              <w:rFonts w:ascii="Cambria Math" w:hAnsi="Cambria Math" w:cstheme="minorHAnsi"/>
-            </w:rPr>
-            <m:t>kΩ</m:t>
-          </m:r>
-          <m:r>
-            <w:rPr>
-              <w:rFonts w:ascii="Cambria Math" w:hAnsi="Cambria Math" w:cstheme="minorHAnsi"/>
-            </w:rPr>
-            <m:t>∙</m:t>
-          </m:r>
-          <m:r>
-            <w:rPr>
-              <w:rFonts w:ascii="Cambria Math" w:hAnsi="Cambria Math" w:cstheme="minorHAnsi"/>
-            </w:rPr>
-            <m:t>5,21 mA</m:t>
-          </m:r>
-          <m:r>
-            <w:rPr>
-              <w:rFonts w:ascii="Cambria Math" w:hAnsi="Cambria Math" w:cstheme="minorHAnsi"/>
-            </w:rPr>
-            <m:t>=6,78 V</m:t>
+            <m:t>=1,30kΩ∙5,21 mA=6,78 V</m:t>
           </m:r>
         </m:oMath>
       </m:oMathPara>
@@ -4479,26 +4259,34 @@
             <w:rPr>
               <w:rFonts w:ascii="Cambria Math" w:hAnsi="Cambria Math" w:cstheme="minorHAnsi"/>
             </w:rPr>
-            <m:t>=</m:t>
+            <m:t>=-</m:t>
           </m:r>
-          <m:r>
-            <w:rPr>
-              <w:rFonts w:ascii="Cambria Math" w:hAnsi="Cambria Math" w:cstheme="minorHAnsi"/>
-            </w:rPr>
-            <m:t>-</m:t>
-          </m:r>
-          <m:r>
-            <w:rPr>
-              <w:rFonts w:ascii="Cambria Math" w:hAnsi="Cambria Math" w:cstheme="minorHAnsi"/>
-            </w:rPr>
-            <m:t>R</m:t>
-          </m:r>
-          <m:r>
-            <w:rPr>
-              <w:rFonts w:ascii="Cambria Math" w:hAnsi="Cambria Math" w:cstheme="minorHAnsi"/>
-            </w:rPr>
-            <m:t>4</m:t>
-          </m:r>
+          <m:sSub>
+            <m:sSubPr>
+              <m:ctrlPr>
+                <w:rPr>
+                  <w:rFonts w:ascii="Cambria Math" w:hAnsi="Cambria Math" w:cstheme="minorHAnsi"/>
+                  <w:i/>
+                </w:rPr>
+              </m:ctrlPr>
+            </m:sSubPr>
+            <m:e>
+              <m:r>
+                <w:rPr>
+                  <w:rFonts w:ascii="Cambria Math" w:hAnsi="Cambria Math" w:cstheme="minorHAnsi"/>
+                </w:rPr>
+                <m:t>R</m:t>
+              </m:r>
+            </m:e>
+            <m:sub>
+              <m:r>
+                <w:rPr>
+                  <w:rFonts w:ascii="Cambria Math" w:hAnsi="Cambria Math" w:cstheme="minorHAnsi"/>
+                </w:rPr>
+                <m:t>4</m:t>
+              </m:r>
+            </m:sub>
+          </m:sSub>
           <m:r>
             <w:rPr>
               <w:rFonts w:ascii="Cambria Math" w:hAnsi="Cambria Math" w:cstheme="minorHAnsi"/>
@@ -4650,31 +4438,7 @@
             <w:rPr>
               <w:rFonts w:ascii="Cambria Math" w:hAnsi="Cambria Math" w:cstheme="minorHAnsi"/>
             </w:rPr>
-            <m:t>=-1,3</m:t>
-          </m:r>
-          <m:r>
-            <w:rPr>
-              <w:rFonts w:ascii="Cambria Math" w:hAnsi="Cambria Math" w:cstheme="minorHAnsi"/>
-            </w:rPr>
-            <m:t>0 kΩ ∙</m:t>
-          </m:r>
-          <m:r>
-            <w:rPr>
-              <w:rFonts w:ascii="Cambria Math" w:hAnsi="Cambria Math" w:cstheme="minorHAnsi"/>
-            </w:rPr>
-            <m:t>5,21mA-0,7 V-</m:t>
-          </m:r>
-          <m:r>
-            <w:rPr>
-              <w:rFonts w:ascii="Cambria Math" w:hAnsi="Cambria Math" w:cstheme="minorHAnsi"/>
-            </w:rPr>
-            <m:t>(-9,00V)</m:t>
-          </m:r>
-          <m:r>
-            <w:rPr>
-              <w:rFonts w:ascii="Cambria Math" w:hAnsi="Cambria Math" w:cstheme="minorHAnsi"/>
-            </w:rPr>
-            <m:t>=1,53 V</m:t>
+            <m:t>=-1,30 kΩ ∙5,21mA-0,7 V-(-9,00V)=1,53 V</m:t>
           </m:r>
         </m:oMath>
       </m:oMathPara>
@@ -4882,16 +4646,6 @@
           <w:rFonts w:ascii="Calibri" w:hAnsi="Calibri"/>
         </w:rPr>
       </w:pPr>
-      <w:bookmarkStart w:id="0" w:name="_GoBack"/>
-      <w:bookmarkEnd w:id="0"/>
-    </w:p>
-    <w:p>
-      <w:pPr>
-        <w:pStyle w:val="Standard"/>
-        <w:rPr>
-          <w:rFonts w:ascii="Calibri" w:hAnsi="Calibri"/>
-        </w:rPr>
-      </w:pPr>
       <w:r>
         <w:rPr>
           <w:rFonts w:ascii="Calibri" w:hAnsi="Calibri"/>
@@ -4900,6 +4654,7 @@
           <w:sz w:val="28"/>
           <w:szCs w:val="28"/>
         </w:rPr>
+        <w:lastRenderedPageBreak/>
         <w:t>2.</w:t>
       </w:r>
       <w:r>
@@ -4930,18 +4685,13 @@
         <w:rPr>
           <w:rFonts w:ascii="Calibri" w:hAnsi="Calibri"/>
         </w:rPr>
-        <w:t xml:space="preserve">Dokumentacja przeprowadzonej obserwacji </w:t>
-      </w:r>
-      <w:r>
-        <w:rPr>
-          <w:rFonts w:ascii="Calibri" w:hAnsi="Calibri"/>
-          <w:i/>
-          <w:iCs/>
-          <w:color w:val="FF0000"/>
-          <w:sz w:val="21"/>
-          <w:szCs w:val="21"/>
-        </w:rPr>
-        <w:t>(obraz ekranu oscyloskopu)</w:t>
+        <w:t>Dokument</w:t>
+      </w:r>
+      <w:r>
+        <w:rPr>
+          <w:rFonts w:ascii="Calibri" w:hAnsi="Calibri"/>
+        </w:rPr>
+        <w:t>acja przeprowadzonej obserwacji</w:t>
       </w:r>
       <w:r>
         <w:rPr>
@@ -4953,6 +4703,113 @@
     <w:p>
       <w:pPr>
         <w:pStyle w:val="Standard"/>
+        <w:rPr>
+          <w:rFonts w:asciiTheme="minorHAnsi" w:hAnsiTheme="minorHAnsi" w:cstheme="minorHAnsi"/>
+        </w:rPr>
+      </w:pPr>
+      <w:r>
+        <w:rPr>
+          <w:rFonts w:asciiTheme="minorHAnsi" w:hAnsiTheme="minorHAnsi" w:cstheme="minorHAnsi"/>
+        </w:rPr>
+        <w:t>W generatorze ustawiono:</w:t>
+      </w:r>
+      <w:r>
+        <w:rPr>
+          <w:rFonts w:asciiTheme="minorHAnsi" w:hAnsiTheme="minorHAnsi" w:cstheme="minorHAnsi"/>
+        </w:rPr>
+        <w:tab/>
+        <w:t xml:space="preserve">częstotliwość sygnału </w:t>
+      </w:r>
+      <w:r>
+        <w:rPr>
+          <w:rFonts w:asciiTheme="minorHAnsi" w:hAnsiTheme="minorHAnsi" w:cstheme="minorHAnsi"/>
+          <w:i/>
+          <w:iCs/>
+        </w:rPr>
+        <w:t>f</w:t>
+      </w:r>
+      <w:r>
+        <w:rPr>
+          <w:rFonts w:asciiTheme="minorHAnsi" w:hAnsiTheme="minorHAnsi" w:cstheme="minorHAnsi"/>
+          <w:i/>
+          <w:iCs/>
+          <w:vertAlign w:val="subscript"/>
+        </w:rPr>
+        <w:t>1</w:t>
+      </w:r>
+      <w:r>
+        <w:rPr>
+          <w:rFonts w:asciiTheme="minorHAnsi" w:hAnsiTheme="minorHAnsi" w:cstheme="minorHAnsi"/>
+        </w:rPr>
+        <w:t> = 1</w:t>
+      </w:r>
+      <w:r>
+        <w:rPr>
+          <w:rFonts w:asciiTheme="minorHAnsi" w:hAnsiTheme="minorHAnsi" w:cstheme="minorHAnsi"/>
+        </w:rPr>
+        <w:t>0 kHz;</w:t>
+      </w:r>
+    </w:p>
+    <w:p>
+      <w:pPr>
+        <w:pStyle w:val="Standard"/>
+        <w:rPr>
+          <w:rFonts w:asciiTheme="minorHAnsi" w:hAnsiTheme="minorHAnsi" w:cstheme="minorHAnsi"/>
+        </w:rPr>
+      </w:pPr>
+      <w:r>
+        <w:rPr>
+          <w:rFonts w:asciiTheme="minorHAnsi" w:hAnsiTheme="minorHAnsi" w:cstheme="minorHAnsi"/>
+        </w:rPr>
+        <w:tab/>
+      </w:r>
+      <w:r>
+        <w:rPr>
+          <w:rFonts w:asciiTheme="minorHAnsi" w:hAnsiTheme="minorHAnsi" w:cstheme="minorHAnsi"/>
+        </w:rPr>
+        <w:tab/>
+      </w:r>
+      <w:r>
+        <w:rPr>
+          <w:rFonts w:asciiTheme="minorHAnsi" w:hAnsiTheme="minorHAnsi" w:cstheme="minorHAnsi"/>
+        </w:rPr>
+        <w:tab/>
+      </w:r>
+      <w:r>
+        <w:rPr>
+          <w:rFonts w:asciiTheme="minorHAnsi" w:hAnsiTheme="minorHAnsi" w:cstheme="minorHAnsi"/>
+        </w:rPr>
+        <w:tab/>
+        <w:t xml:space="preserve">wartość międzyszczytową </w:t>
+      </w:r>
+      <w:r>
+        <w:rPr>
+          <w:rFonts w:asciiTheme="minorHAnsi" w:hAnsiTheme="minorHAnsi" w:cstheme="minorHAnsi"/>
+          <w:i/>
+          <w:iCs/>
+        </w:rPr>
+        <w:t>E</w:t>
+      </w:r>
+      <w:r>
+        <w:rPr>
+          <w:rFonts w:asciiTheme="minorHAnsi" w:hAnsiTheme="minorHAnsi" w:cstheme="minorHAnsi"/>
+          <w:i/>
+          <w:iCs/>
+          <w:vertAlign w:val="subscript"/>
+        </w:rPr>
+        <w:t>g</w:t>
+      </w:r>
+      <w:r>
+        <w:rPr>
+          <w:rFonts w:asciiTheme="minorHAnsi" w:hAnsiTheme="minorHAnsi" w:cstheme="minorHAnsi"/>
+        </w:rPr>
+        <w:t> = 10 mV.</w:t>
+      </w:r>
+    </w:p>
+    <w:p>
+      <w:pPr>
+        <w:pStyle w:val="Standard"/>
+        <w:jc w:val="center"/>
         <w:rPr>
           <w:rFonts w:ascii="Calibri" w:hAnsi="Calibri"/>
         </w:rPr>
@@ -4964,17 +4821,9 @@
           <w:lang w:val="ru-RU" w:eastAsia="ru-RU" w:bidi="ar-SA"/>
         </w:rPr>
         <w:drawing>
-          <wp:anchor distT="0" distB="0" distL="114300" distR="114300" simplePos="0" relativeHeight="251659264" behindDoc="0" locked="0" layoutInCell="1" allowOverlap="1">
-            <wp:simplePos x="0" y="0"/>
-            <wp:positionH relativeFrom="column">
-              <wp:align>center</wp:align>
-            </wp:positionH>
-            <wp:positionV relativeFrom="paragraph">
-              <wp:align>top</wp:align>
-            </wp:positionV>
-            <wp:extent cx="6120000" cy="3585960"/>
-            <wp:effectExtent l="0" t="0" r="0" b="0"/>
-            <wp:wrapSquare wrapText="bothSides"/>
+          <wp:inline distT="0" distB="0" distL="0" distR="0">
+            <wp:extent cx="4086225" cy="2394287"/>
+            <wp:effectExtent l="0" t="0" r="0" b="6350"/>
             <wp:docPr id="2" name="Obraz2"/>
             <wp:cNvGraphicFramePr/>
             <a:graphic xmlns:a="http://schemas.openxmlformats.org/drawingml/2006/main">
@@ -4985,9 +4834,14 @@
                     <pic:cNvPicPr/>
                   </pic:nvPicPr>
                   <pic:blipFill>
-                    <a:blip r:embed="rId8">
+                    <a:blip r:embed="rId8" cstate="print">
                       <a:lum/>
                       <a:alphaModFix/>
+                      <a:extLst>
+                        <a:ext uri="{28A0092B-C50C-407E-A947-70E740481C1C}">
+                          <a14:useLocalDpi xmlns:a14="http://schemas.microsoft.com/office/drawing/2010/main" val="0"/>
+                        </a:ext>
+                      </a:extLst>
                     </a:blip>
                     <a:srcRect/>
                     <a:stretch>
@@ -4997,7 +4851,7 @@
                   <pic:spPr>
                     <a:xfrm>
                       <a:off x="0" y="0"/>
-                      <a:ext cx="6120000" cy="3585960"/>
+                      <a:ext cx="4092078" cy="2397716"/>
                     </a:xfrm>
                     <a:prstGeom prst="rect">
                       <a:avLst/>
@@ -5007,8 +4861,35 @@
                 </pic:pic>
               </a:graphicData>
             </a:graphic>
-          </wp:anchor>
+          </wp:inline>
         </w:drawing>
+      </w:r>
+    </w:p>
+    <w:p>
+      <w:pPr>
+        <w:pStyle w:val="Standard"/>
+        <w:jc w:val="center"/>
+        <w:rPr>
+          <w:rFonts w:ascii="Calibri" w:hAnsi="Calibri"/>
+        </w:rPr>
+      </w:pPr>
+      <w:r>
+        <w:rPr>
+          <w:rFonts w:ascii="Calibri" w:hAnsi="Calibri"/>
+        </w:rPr>
+        <w:t xml:space="preserve">Rys. 2.1 </w:t>
+      </w:r>
+      <w:r>
+        <w:rPr>
+          <w:rFonts w:ascii="Calibri" w:hAnsi="Calibri"/>
+        </w:rPr>
+        <w:t>CH1 – sygnał z generator</w:t>
+      </w:r>
+      <w:r>
+        <w:rPr>
+          <w:rFonts w:ascii="Calibri" w:hAnsi="Calibri"/>
+        </w:rPr>
+        <w:t>a, CH2 – napięcie wyjściowe</w:t>
       </w:r>
     </w:p>
     <w:p>
@@ -5106,6 +4987,375 @@
         <w:pStyle w:val="Standard"/>
         <w:rPr>
           <w:rFonts w:ascii="Calibri" w:hAnsi="Calibri"/>
+        </w:rPr>
+      </w:pPr>
+      <w:r>
+        <w:rPr>
+          <w:rFonts w:ascii="Calibri" w:hAnsi="Calibri"/>
+        </w:rPr>
+        <w:t>Wartość zmierzonego</w:t>
+      </w:r>
+      <w:r>
+        <w:rPr>
+          <w:rFonts w:ascii="Calibri" w:hAnsi="Calibri"/>
+        </w:rPr>
+        <w:t xml:space="preserve"> napięcia na emiterze</w:t>
+      </w:r>
+      <w:r>
+        <w:rPr>
+          <w:rFonts w:ascii="Calibri" w:hAnsi="Calibri"/>
+        </w:rPr>
+        <w:t xml:space="preserve"> zaczyna się odcinać od dołu i uzyskuje wartość:</w:t>
+      </w:r>
+    </w:p>
+    <w:p>
+      <w:pPr>
+        <w:pStyle w:val="Standard"/>
+        <w:rPr>
+          <w:rFonts w:ascii="Calibri" w:hAnsi="Calibri"/>
+        </w:rPr>
+      </w:pPr>
+    </w:p>
+    <w:p>
+      <w:pPr>
+        <w:pStyle w:val="Standard"/>
+        <w:rPr>
+          <w:rFonts w:ascii="Calibri" w:hAnsi="Calibri"/>
+        </w:rPr>
+      </w:pPr>
+      <m:oMathPara>
+        <m:oMath>
+          <m:sSub>
+            <m:sSubPr>
+              <m:ctrlPr>
+                <w:rPr>
+                  <w:rFonts w:ascii="Cambria Math" w:hAnsi="Cambria Math"/>
+                  <w:i/>
+                </w:rPr>
+              </m:ctrlPr>
+            </m:sSubPr>
+            <m:e>
+              <m:r>
+                <w:rPr>
+                  <w:rFonts w:ascii="Cambria Math" w:hAnsi="Cambria Math"/>
+                </w:rPr>
+                <m:t>V</m:t>
+              </m:r>
+            </m:e>
+            <m:sub>
+              <m:r>
+                <w:rPr>
+                  <w:rFonts w:ascii="Cambria Math" w:hAnsi="Cambria Math"/>
+                  <w:vertAlign w:val="subscript"/>
+                </w:rPr>
+                <m:t>min2</m:t>
+              </m:r>
+            </m:sub>
+          </m:sSub>
+          <m:r>
+            <w:rPr>
+              <w:rFonts w:ascii="Cambria Math" w:hAnsi="Cambria Math"/>
+            </w:rPr>
+            <m:t> = -3,03 V</m:t>
+          </m:r>
+        </m:oMath>
+      </m:oMathPara>
+    </w:p>
+    <w:p>
+      <w:pPr>
+        <w:pStyle w:val="Standard"/>
+        <w:rPr>
+          <w:rFonts w:ascii="Calibri" w:hAnsi="Calibri"/>
+        </w:rPr>
+      </w:pPr>
+    </w:p>
+    <w:p>
+      <w:pPr>
+        <w:pStyle w:val="Standard"/>
+        <w:rPr>
+          <w:rFonts w:ascii="Calibri" w:hAnsi="Calibri"/>
+        </w:rPr>
+      </w:pPr>
+      <w:r>
+        <w:rPr>
+          <w:rFonts w:ascii="Calibri" w:hAnsi="Calibri"/>
+        </w:rPr>
+        <w:t>Natomiast przesuniecie skladowej stalej wynioslo</w:t>
+      </w:r>
+      <w:r>
+        <w:rPr>
+          <w:rFonts w:ascii="Calibri" w:hAnsi="Calibri"/>
+        </w:rPr>
+        <w:t xml:space="preserve"> zza punktu pracy tranzystora</w:t>
+      </w:r>
+      <w:r>
+        <w:rPr>
+          <w:rFonts w:ascii="Calibri" w:hAnsi="Calibri"/>
+        </w:rPr>
+        <w:t>:</w:t>
+      </w:r>
+    </w:p>
+    <w:p>
+      <w:pPr>
+        <w:pStyle w:val="Standard"/>
+        <w:rPr>
+          <w:rFonts w:ascii="Calibri" w:hAnsi="Calibri"/>
+        </w:rPr>
+      </w:pPr>
+    </w:p>
+    <w:p>
+      <w:pPr>
+        <w:pStyle w:val="Standard"/>
+        <w:rPr>
+          <w:rFonts w:ascii="Calibri" w:hAnsi="Calibri"/>
+        </w:rPr>
+      </w:pPr>
+      <m:oMathPara>
+        <m:oMath>
+          <m:sSub>
+            <m:sSubPr>
+              <m:ctrlPr>
+                <w:rPr>
+                  <w:rFonts w:ascii="Cambria Math" w:hAnsi="Cambria Math"/>
+                  <w:i/>
+                </w:rPr>
+              </m:ctrlPr>
+            </m:sSubPr>
+            <m:e>
+              <m:r>
+                <w:rPr>
+                  <w:rFonts w:ascii="Cambria Math" w:hAnsi="Cambria Math"/>
+                </w:rPr>
+                <m:t>U</m:t>
+              </m:r>
+            </m:e>
+            <m:sub>
+              <m:r>
+                <w:rPr>
+                  <w:rFonts w:ascii="Cambria Math" w:hAnsi="Cambria Math"/>
+                </w:rPr>
+                <m:t>E</m:t>
+              </m:r>
+            </m:sub>
+          </m:sSub>
+          <m:r>
+            <w:rPr>
+              <w:rFonts w:ascii="Cambria Math" w:hAnsi="Cambria Math"/>
+            </w:rPr>
+            <m:t>≈-</m:t>
+          </m:r>
+          <m:r>
+            <w:rPr>
+              <w:rFonts w:ascii="Cambria Math" w:hAnsi="Cambria Math"/>
+            </w:rPr>
+            <m:t>2,28</m:t>
+          </m:r>
+          <m:r>
+            <w:rPr>
+              <w:rFonts w:ascii="Cambria Math" w:hAnsi="Cambria Math"/>
+            </w:rPr>
+            <m:t xml:space="preserve"> V</m:t>
+          </m:r>
+        </m:oMath>
+      </m:oMathPara>
+    </w:p>
+    <w:p>
+      <w:pPr>
+        <w:pStyle w:val="Standard"/>
+        <w:rPr>
+          <w:rFonts w:ascii="Calibri" w:hAnsi="Calibri"/>
+        </w:rPr>
+      </w:pPr>
+    </w:p>
+    <w:p>
+      <w:pPr>
+        <w:pStyle w:val="Standard"/>
+        <w:rPr>
+          <w:rFonts w:ascii="Calibri" w:hAnsi="Calibri"/>
+        </w:rPr>
+      </w:pPr>
+      <w:r>
+        <w:rPr>
+          <w:rFonts w:ascii="Calibri" w:hAnsi="Calibri"/>
+        </w:rPr>
+        <w:t>Z tego możemy obliczyć:</w:t>
+      </w:r>
+    </w:p>
+    <w:p>
+      <w:pPr>
+        <w:pStyle w:val="Standard"/>
+        <w:rPr>
+          <w:rFonts w:ascii="Calibri" w:hAnsi="Calibri"/>
+          <w:iCs/>
+        </w:rPr>
+      </w:pPr>
+      <w:r>
+        <w:rPr>
+          <w:rFonts w:ascii="Calibri" w:hAnsi="Calibri"/>
+        </w:rPr>
+        <w:br/>
+      </w:r>
+      <m:oMathPara>
+        <m:oMath>
+          <m:sSub>
+            <m:sSubPr>
+              <m:ctrlPr>
+                <w:rPr>
+                  <w:rFonts w:ascii="Cambria Math" w:hAnsi="Cambria Math"/>
+                  <w:i/>
+                  <w:iCs/>
+                </w:rPr>
+              </m:ctrlPr>
+            </m:sSubPr>
+            <m:e>
+              <m:r>
+                <w:rPr>
+                  <w:rFonts w:ascii="Cambria Math" w:hAnsi="Cambria Math"/>
+                </w:rPr>
+                <m:t>U</m:t>
+              </m:r>
+            </m:e>
+            <m:sub>
+              <m:r>
+                <w:rPr>
+                  <w:rFonts w:ascii="Cambria Math" w:hAnsi="Cambria Math"/>
+                  <w:vertAlign w:val="subscript"/>
+                </w:rPr>
+                <m:t>OmaxBJT</m:t>
+              </m:r>
+            </m:sub>
+          </m:sSub>
+          <m:r>
+            <w:rPr>
+              <w:rFonts w:ascii="Cambria Math" w:hAnsi="Cambria Math"/>
+            </w:rPr>
+            <m:t>=</m:t>
+          </m:r>
+          <m:sSub>
+            <m:sSubPr>
+              <m:ctrlPr>
+                <w:rPr>
+                  <w:rFonts w:ascii="Cambria Math" w:hAnsi="Cambria Math"/>
+                  <w:i/>
+                  <w:iCs/>
+                </w:rPr>
+              </m:ctrlPr>
+            </m:sSubPr>
+            <m:e>
+              <m:r>
+                <w:rPr>
+                  <w:rFonts w:ascii="Cambria Math" w:hAnsi="Cambria Math"/>
+                </w:rPr>
+                <m:t>U</m:t>
+              </m:r>
+            </m:e>
+            <m:sub>
+              <m:r>
+                <w:rPr>
+                  <w:rFonts w:ascii="Cambria Math" w:hAnsi="Cambria Math"/>
+                </w:rPr>
+                <m:t>E</m:t>
+              </m:r>
+            </m:sub>
+          </m:sSub>
+          <m:r>
+            <w:rPr>
+              <w:rFonts w:ascii="Cambria Math" w:hAnsi="Cambria Math"/>
+            </w:rPr>
+            <m:t>-</m:t>
+          </m:r>
+          <m:sSub>
+            <m:sSubPr>
+              <m:ctrlPr>
+                <w:rPr>
+                  <w:rFonts w:ascii="Cambria Math" w:hAnsi="Cambria Math"/>
+                  <w:i/>
+                  <w:iCs/>
+                </w:rPr>
+              </m:ctrlPr>
+            </m:sSubPr>
+            <m:e>
+              <m:r>
+                <w:rPr>
+                  <w:rFonts w:ascii="Cambria Math" w:hAnsi="Cambria Math"/>
+                </w:rPr>
+                <m:t>V</m:t>
+              </m:r>
+            </m:e>
+            <m:sub>
+              <m:r>
+                <w:rPr>
+                  <w:rFonts w:ascii="Cambria Math" w:hAnsi="Cambria Math"/>
+                </w:rPr>
+                <m:t>min2</m:t>
+              </m:r>
+            </m:sub>
+          </m:sSub>
+          <m:r>
+            <w:rPr>
+              <w:rFonts w:ascii="Cambria Math" w:hAnsi="Cambria Math"/>
+            </w:rPr>
+            <m:t>=-2</m:t>
+          </m:r>
+          <m:r>
+            <w:rPr>
+              <w:rFonts w:ascii="Cambria Math" w:hAnsi="Cambria Math"/>
+            </w:rPr>
+            <m:t>,28</m:t>
+          </m:r>
+          <m:r>
+            <w:rPr>
+              <w:rFonts w:ascii="Cambria Math" w:hAnsi="Cambria Math"/>
+            </w:rPr>
+            <m:t xml:space="preserve"> V-</m:t>
+          </m:r>
+          <m:d>
+            <m:dPr>
+              <m:ctrlPr>
+                <w:rPr>
+                  <w:rFonts w:ascii="Cambria Math" w:hAnsi="Cambria Math"/>
+                  <w:i/>
+                  <w:iCs/>
+                </w:rPr>
+              </m:ctrlPr>
+            </m:dPr>
+            <m:e>
+              <m:r>
+                <w:rPr>
+                  <w:rFonts w:ascii="Cambria Math" w:hAnsi="Cambria Math"/>
+                </w:rPr>
+                <m:t>-3,03 V</m:t>
+              </m:r>
+            </m:e>
+          </m:d>
+          <m:r>
+            <w:rPr>
+              <w:rFonts w:ascii="Cambria Math" w:hAnsi="Cambria Math"/>
+            </w:rPr>
+            <m:t>=0,75</m:t>
+          </m:r>
+          <m:r>
+            <w:rPr>
+              <w:rFonts w:ascii="Cambria Math" w:hAnsi="Cambria Math"/>
+            </w:rPr>
+            <m:t xml:space="preserve"> V</m:t>
+          </m:r>
+        </m:oMath>
+      </m:oMathPara>
+    </w:p>
+    <w:p>
+      <w:pPr>
+        <w:pStyle w:val="Standard"/>
+        <w:rPr>
+          <w:rFonts w:ascii="Calibri" w:hAnsi="Calibri"/>
+        </w:rPr>
+      </w:pPr>
+    </w:p>
+    <w:p>
+      <w:pPr>
+        <w:pStyle w:val="Standard"/>
+        <w:rPr>
+          <w:rFonts w:ascii="Calibri" w:hAnsi="Calibri"/>
           <w:i/>
           <w:iCs/>
         </w:rPr>
@@ -5126,6 +5376,414 @@
           <w:rFonts w:ascii="Calibri" w:hAnsi="Calibri"/>
         </w:rPr>
       </w:pPr>
+    </w:p>
+    <w:p>
+      <w:pPr>
+        <w:pStyle w:val="Standard"/>
+        <w:rPr>
+          <w:rFonts w:ascii="Calibri" w:hAnsi="Calibri"/>
+          <w:i/>
+          <w:iCs/>
+        </w:rPr>
+      </w:pPr>
+      <m:oMathPara>
+        <m:oMath>
+          <m:sSub>
+            <m:sSubPr>
+              <m:ctrlPr>
+                <w:rPr>
+                  <w:rFonts w:ascii="Cambria Math" w:hAnsi="Cambria Math"/>
+                  <w:i/>
+                  <w:iCs/>
+                </w:rPr>
+              </m:ctrlPr>
+            </m:sSubPr>
+            <m:e>
+              <m:r>
+                <w:rPr>
+                  <w:rFonts w:ascii="Cambria Math" w:hAnsi="Cambria Math"/>
+                </w:rPr>
+                <m:t>U</m:t>
+              </m:r>
+            </m:e>
+            <m:sub>
+              <m:r>
+                <w:rPr>
+                  <w:rFonts w:ascii="Cambria Math" w:hAnsi="Cambria Math"/>
+                </w:rPr>
+                <m:t>OmaxBJ</m:t>
+              </m:r>
+              <m:sSub>
+                <m:sSubPr>
+                  <m:ctrlPr>
+                    <w:rPr>
+                      <w:rFonts w:ascii="Cambria Math" w:hAnsi="Cambria Math"/>
+                      <w:i/>
+                      <w:iCs/>
+                    </w:rPr>
+                  </m:ctrlPr>
+                </m:sSubPr>
+                <m:e>
+                  <m:r>
+                    <w:rPr>
+                      <w:rFonts w:ascii="Cambria Math" w:hAnsi="Cambria Math"/>
+                    </w:rPr>
+                    <m:t>T</m:t>
+                  </m:r>
+                </m:e>
+                <m:sub>
+                  <m:r>
+                    <w:rPr>
+                      <w:rFonts w:ascii="Cambria Math" w:hAnsi="Cambria Math"/>
+                    </w:rPr>
+                    <m:t>teor</m:t>
+                  </m:r>
+                </m:sub>
+              </m:sSub>
+            </m:sub>
+          </m:sSub>
+          <m:r>
+            <w:rPr>
+              <w:rFonts w:ascii="Cambria Math" w:hAnsi="Cambria Math"/>
+            </w:rPr>
+            <m:t xml:space="preserve"> = </m:t>
+          </m:r>
+          <m:sSub>
+            <m:sSubPr>
+              <m:ctrlPr>
+                <w:rPr>
+                  <w:rFonts w:ascii="Cambria Math" w:hAnsi="Cambria Math"/>
+                  <w:i/>
+                  <w:iCs/>
+                </w:rPr>
+              </m:ctrlPr>
+            </m:sSubPr>
+            <m:e>
+              <m:r>
+                <w:rPr>
+                  <w:rFonts w:ascii="Cambria Math" w:hAnsi="Cambria Math"/>
+                </w:rPr>
+                <m:t>I</m:t>
+              </m:r>
+            </m:e>
+            <m:sub>
+              <m:sSub>
+                <m:sSubPr>
+                  <m:ctrlPr>
+                    <w:rPr>
+                      <w:rFonts w:ascii="Cambria Math" w:hAnsi="Cambria Math"/>
+                      <w:i/>
+                      <w:iCs/>
+                    </w:rPr>
+                  </m:ctrlPr>
+                </m:sSubPr>
+                <m:e>
+                  <m:r>
+                    <w:rPr>
+                      <w:rFonts w:ascii="Cambria Math" w:hAnsi="Cambria Math"/>
+                    </w:rPr>
+                    <m:t>E</m:t>
+                  </m:r>
+                </m:e>
+                <m:sub>
+                  <m:r>
+                    <w:rPr>
+                      <w:rFonts w:ascii="Cambria Math" w:hAnsi="Cambria Math"/>
+                    </w:rPr>
+                    <m:t>teor</m:t>
+                  </m:r>
+                </m:sub>
+              </m:sSub>
+            </m:sub>
+          </m:sSub>
+          <m:r>
+            <w:rPr>
+              <w:rFonts w:ascii="Cambria Math" w:hAnsi="Cambria Math"/>
+            </w:rPr>
+            <m:t xml:space="preserve"> ∙</m:t>
+          </m:r>
+          <m:r>
+            <w:rPr>
+              <w:rFonts w:ascii="Cambria Math" w:hAnsi="Cambria Math"/>
+            </w:rPr>
+            <m:t xml:space="preserve"> </m:t>
+          </m:r>
+          <m:sSub>
+            <m:sSubPr>
+              <m:ctrlPr>
+                <w:rPr>
+                  <w:rFonts w:ascii="Cambria Math" w:hAnsi="Cambria Math"/>
+                  <w:i/>
+                  <w:iCs/>
+                </w:rPr>
+              </m:ctrlPr>
+            </m:sSubPr>
+            <m:e>
+              <m:r>
+                <w:rPr>
+                  <w:rFonts w:ascii="Cambria Math" w:hAnsi="Cambria Math"/>
+                </w:rPr>
+                <m:t>R</m:t>
+              </m:r>
+            </m:e>
+            <m:sub>
+              <m:r>
+                <w:rPr>
+                  <w:rFonts w:ascii="Cambria Math" w:hAnsi="Cambria Math"/>
+                </w:rPr>
+                <m:t>4</m:t>
+              </m:r>
+            </m:sub>
+          </m:sSub>
+          <m:r>
+            <w:rPr>
+              <w:rFonts w:ascii="Cambria Math" w:hAnsi="Cambria Math"/>
+            </w:rPr>
+            <m:t>||</m:t>
+          </m:r>
+          <m:sSub>
+            <m:sSubPr>
+              <m:ctrlPr>
+                <w:rPr>
+                  <w:rFonts w:ascii="Cambria Math" w:hAnsi="Cambria Math"/>
+                  <w:i/>
+                  <w:iCs/>
+                </w:rPr>
+              </m:ctrlPr>
+            </m:sSubPr>
+            <m:e>
+              <m:r>
+                <w:rPr>
+                  <w:rFonts w:ascii="Cambria Math" w:hAnsi="Cambria Math"/>
+                </w:rPr>
+                <m:t>R</m:t>
+              </m:r>
+            </m:e>
+            <m:sub>
+              <m:r>
+                <w:rPr>
+                  <w:rFonts w:ascii="Cambria Math" w:hAnsi="Cambria Math"/>
+                </w:rPr>
+                <m:t>6</m:t>
+              </m:r>
+            </m:sub>
+          </m:sSub>
+          <m:r>
+            <w:rPr>
+              <w:rFonts w:ascii="Cambria Math" w:hAnsi="Cambria Math"/>
+            </w:rPr>
+            <m:t xml:space="preserve"> = 5,16</m:t>
+          </m:r>
+          <m:r>
+            <w:rPr>
+              <w:rFonts w:ascii="Cambria Math" w:hAnsi="Cambria Math"/>
+            </w:rPr>
+            <m:t xml:space="preserve"> mA</m:t>
+          </m:r>
+          <m:r>
+            <w:rPr>
+              <w:rFonts w:ascii="Cambria Math" w:hAnsi="Cambria Math"/>
+            </w:rPr>
+            <m:t xml:space="preserve"> ∙ 1,3</m:t>
+          </m:r>
+          <m:r>
+            <w:rPr>
+              <w:rFonts w:ascii="Cambria Math" w:hAnsi="Cambria Math"/>
+            </w:rPr>
+            <m:t>0</m:t>
+          </m:r>
+          <m:r>
+            <w:rPr>
+              <w:rFonts w:ascii="Cambria Math" w:hAnsi="Cambria Math"/>
+            </w:rPr>
+            <m:t xml:space="preserve"> kΩ</m:t>
+          </m:r>
+          <m:r>
+            <w:rPr>
+              <w:rFonts w:ascii="Cambria Math" w:hAnsi="Cambria Math"/>
+            </w:rPr>
+            <m:t>||20</m:t>
+          </m:r>
+          <m:r>
+            <w:rPr>
+              <w:rFonts w:ascii="Cambria Math" w:hAnsi="Cambria Math"/>
+            </w:rPr>
+            <m:t>0</m:t>
+          </m:r>
+          <m:r>
+            <w:rPr>
+              <w:rFonts w:ascii="Cambria Math" w:hAnsi="Cambria Math"/>
+            </w:rPr>
+            <m:t>,00</m:t>
+          </m:r>
+          <m:r>
+            <w:rPr>
+              <w:rFonts w:ascii="Cambria Math" w:hAnsi="Cambria Math"/>
+            </w:rPr>
+            <m:t xml:space="preserve"> Ω</m:t>
+          </m:r>
+          <m:r>
+            <w:rPr>
+              <w:rFonts w:ascii="Cambria Math" w:hAnsi="Cambria Math"/>
+            </w:rPr>
+            <m:t xml:space="preserve"> = 0,89</m:t>
+          </m:r>
+          <m:r>
+            <w:rPr>
+              <w:rFonts w:ascii="Cambria Math" w:hAnsi="Cambria Math"/>
+            </w:rPr>
+            <m:t xml:space="preserve"> V</m:t>
+          </m:r>
+        </m:oMath>
+      </m:oMathPara>
+    </w:p>
+    <w:p>
+      <w:pPr>
+        <w:pStyle w:val="Standard"/>
+        <w:rPr>
+          <w:rFonts w:ascii="Calibri" w:hAnsi="Calibri"/>
+          <w:i/>
+          <w:iCs/>
+        </w:rPr>
+      </w:pPr>
+    </w:p>
+    <w:p>
+      <w:pPr>
+        <w:pStyle w:val="Standard"/>
+        <w:rPr>
+          <w:rFonts w:ascii="Calibri" w:hAnsi="Calibri"/>
+          <w:i/>
+          <w:iCs/>
+        </w:rPr>
+      </w:pPr>
+      <w:r>
+        <w:rPr>
+          <w:rFonts w:ascii="Calibri" w:hAnsi="Calibri"/>
+          <w:i/>
+          <w:iCs/>
+          <w:highlight w:val="red"/>
+        </w:rPr>
+        <w:t>Wartość oczekiwana</w:t>
+      </w:r>
+      <w:r>
+        <w:rPr>
+          <w:rFonts w:ascii="Calibri" w:hAnsi="Calibri"/>
+          <w:i/>
+          <w:iCs/>
+          <w:highlight w:val="red"/>
+        </w:rPr>
+        <w:t xml:space="preserve"> różni się od wartości praktycznej o</w:t>
+      </w:r>
+      <m:oMath>
+        <m:r>
+          <w:rPr>
+            <w:rFonts w:ascii="Cambria Math" w:hAnsi="Cambria Math"/>
+            <w:highlight w:val="red"/>
+          </w:rPr>
+          <m:t xml:space="preserve"> ~</m:t>
+        </m:r>
+      </m:oMath>
+      <w:r>
+        <w:rPr>
+          <w:rFonts w:ascii="Calibri" w:hAnsi="Calibri"/>
+          <w:i/>
+          <w:iCs/>
+          <w:highlight w:val="red"/>
+        </w:rPr>
+        <w:t>15</w:t>
+      </w:r>
+      <w:r>
+        <w:rPr>
+          <w:rFonts w:ascii="Calibri" w:hAnsi="Calibri"/>
+          <w:i/>
+          <w:iCs/>
+          <w:highlight w:val="red"/>
+        </w:rPr>
+        <w:t xml:space="preserve">%, </w:t>
+      </w:r>
+      <w:r>
+        <w:rPr>
+          <w:rFonts w:ascii="Calibri" w:hAnsi="Calibri"/>
+          <w:i/>
+          <w:iCs/>
+          <w:highlight w:val="red"/>
+        </w:rPr>
+        <w:t>przy dokładniejszej analizi</w:t>
+      </w:r>
+      <w:r>
+        <w:rPr>
+          <w:rFonts w:ascii="Calibri" w:hAnsi="Calibri"/>
+          <w:i/>
+          <w:iCs/>
+          <w:highlight w:val="red"/>
+        </w:rPr>
+        <w:t>e zauważono, że taki błą</w:t>
+      </w:r>
+      <w:r>
+        <w:rPr>
+          <w:rFonts w:ascii="Calibri" w:hAnsi="Calibri"/>
+          <w:i/>
+          <w:iCs/>
+          <w:highlight w:val="red"/>
+        </w:rPr>
+        <w:t>d może dać</w:t>
+      </w:r>
+      <w:r>
+        <w:rPr>
+          <w:rFonts w:ascii="Calibri" w:hAnsi="Calibri"/>
+          <w:i/>
+          <w:iCs/>
+          <w:highlight w:val="red"/>
+        </w:rPr>
+        <w:t xml:space="preserve"> rozrzut wartości U</w:t>
+      </w:r>
+      <w:r>
+        <w:rPr>
+          <w:rFonts w:ascii="Calibri" w:hAnsi="Calibri"/>
+          <w:i/>
+          <w:iCs/>
+          <w:highlight w:val="red"/>
+          <w:vertAlign w:val="subscript"/>
+        </w:rPr>
+        <w:t xml:space="preserve">E </w:t>
+      </w:r>
+      <w:r>
+        <w:rPr>
+          <w:rFonts w:ascii="Calibri" w:hAnsi="Calibri"/>
+          <w:i/>
+          <w:iCs/>
+          <w:highlight w:val="red"/>
+        </w:rPr>
+        <w:t>o</w:t>
+      </w:r>
+      <w:r>
+        <w:rPr>
+          <w:rFonts w:ascii="Calibri" w:hAnsi="Calibri"/>
+          <w:i/>
+          <w:iCs/>
+          <w:highlight w:val="red"/>
+          <w:vertAlign w:val="subscript"/>
+        </w:rPr>
+        <w:t xml:space="preserve"> </w:t>
+      </w:r>
+      <m:oMath>
+        <m:r>
+          <w:rPr>
+            <w:rFonts w:ascii="Cambria Math" w:hAnsi="Cambria Math"/>
+            <w:highlight w:val="red"/>
+          </w:rPr>
+          <m:t>~</m:t>
+        </m:r>
+      </m:oMath>
+      <w:r>
+        <w:rPr>
+          <w:rFonts w:ascii="Calibri" w:hAnsi="Calibri"/>
+          <w:i/>
+          <w:iCs/>
+          <w:highlight w:val="red"/>
+        </w:rPr>
+        <w:t>6%</w:t>
+      </w:r>
     </w:p>
     <w:p>
       <w:pPr>
@@ -5174,6 +5832,8 @@
         </w:rPr>
         <w:t xml:space="preserve"> Parametry małosygnałowe wtórnika emiterowego</w:t>
       </w:r>
+      <w:bookmarkStart w:id="0" w:name="_GoBack"/>
+      <w:bookmarkEnd w:id="0"/>
     </w:p>
     <w:p>
       <w:pPr>
@@ -5380,12 +6040,6 @@
         <w:gridCol w:w="2200"/>
       </w:tblGrid>
       <w:tr>
-        <w:tblPrEx>
-          <w:tblCellMar>
-            <w:top w:w="0" w:type="dxa"/>
-            <w:bottom w:w="0" w:type="dxa"/>
-          </w:tblCellMar>
-        </w:tblPrEx>
         <w:trPr>
           <w:cantSplit/>
         </w:trPr>
@@ -5486,12 +6140,6 @@
         </w:tc>
       </w:tr>
       <w:tr>
-        <w:tblPrEx>
-          <w:tblCellMar>
-            <w:top w:w="0" w:type="dxa"/>
-            <w:bottom w:w="0" w:type="dxa"/>
-          </w:tblCellMar>
-        </w:tblPrEx>
         <w:trPr>
           <w:cantSplit/>
         </w:trPr>
@@ -5520,7 +6168,6 @@
               <w:rPr>
                 <w:rFonts w:ascii="Calibri" w:hAnsi="Calibri"/>
               </w:rPr>
-              <w:lastRenderedPageBreak/>
               <w:t>Amplituda</w:t>
             </w:r>
             <w:r>
@@ -5635,12 +6282,6 @@
         </w:tc>
       </w:tr>
       <w:tr>
-        <w:tblPrEx>
-          <w:tblCellMar>
-            <w:top w:w="0" w:type="dxa"/>
-            <w:bottom w:w="0" w:type="dxa"/>
-          </w:tblCellMar>
-        </w:tblPrEx>
         <w:trPr>
           <w:cantSplit/>
         </w:trPr>
@@ -5770,12 +6411,6 @@
         </w:tc>
       </w:tr>
       <w:tr>
-        <w:tblPrEx>
-          <w:tblCellMar>
-            <w:top w:w="0" w:type="dxa"/>
-            <w:bottom w:w="0" w:type="dxa"/>
-          </w:tblCellMar>
-        </w:tblPrEx>
         <w:trPr>
           <w:cantSplit/>
         </w:trPr>
@@ -5898,12 +6533,6 @@
         </w:tc>
       </w:tr>
       <w:tr>
-        <w:tblPrEx>
-          <w:tblCellMar>
-            <w:top w:w="0" w:type="dxa"/>
-            <w:bottom w:w="0" w:type="dxa"/>
-          </w:tblCellMar>
-        </w:tblPrEx>
         <w:trPr>
           <w:cantSplit/>
         </w:trPr>
@@ -6038,12 +6667,6 @@
         </w:tc>
       </w:tr>
       <w:tr>
-        <w:tblPrEx>
-          <w:tblCellMar>
-            <w:top w:w="0" w:type="dxa"/>
-            <w:bottom w:w="0" w:type="dxa"/>
-          </w:tblCellMar>
-        </w:tblPrEx>
         <w:trPr>
           <w:cantSplit/>
         </w:trPr>
@@ -6178,12 +6801,6 @@
         </w:tc>
       </w:tr>
       <w:tr>
-        <w:tblPrEx>
-          <w:tblCellMar>
-            <w:top w:w="0" w:type="dxa"/>
-            <w:bottom w:w="0" w:type="dxa"/>
-          </w:tblCellMar>
-        </w:tblPrEx>
         <w:trPr>
           <w:cantSplit/>
         </w:trPr>
@@ -6796,12 +7413,6 @@
         <w:gridCol w:w="2238"/>
       </w:tblGrid>
       <w:tr>
-        <w:tblPrEx>
-          <w:tblCellMar>
-            <w:top w:w="0" w:type="dxa"/>
-            <w:bottom w:w="0" w:type="dxa"/>
-          </w:tblCellMar>
-        </w:tblPrEx>
         <w:trPr>
           <w:cantSplit/>
         </w:trPr>
@@ -6902,12 +7513,6 @@
         </w:tc>
       </w:tr>
       <w:tr>
-        <w:tblPrEx>
-          <w:tblCellMar>
-            <w:top w:w="0" w:type="dxa"/>
-            <w:bottom w:w="0" w:type="dxa"/>
-          </w:tblCellMar>
-        </w:tblPrEx>
         <w:trPr>
           <w:cantSplit/>
         </w:trPr>
@@ -7037,12 +7642,6 @@
         </w:tc>
       </w:tr>
       <w:tr>
-        <w:tblPrEx>
-          <w:tblCellMar>
-            <w:top w:w="0" w:type="dxa"/>
-            <w:bottom w:w="0" w:type="dxa"/>
-          </w:tblCellMar>
-        </w:tblPrEx>
         <w:trPr>
           <w:cantSplit/>
         </w:trPr>
@@ -7172,12 +7771,6 @@
         </w:tc>
       </w:tr>
       <w:tr>
-        <w:tblPrEx>
-          <w:tblCellMar>
-            <w:top w:w="0" w:type="dxa"/>
-            <w:bottom w:w="0" w:type="dxa"/>
-          </w:tblCellMar>
-        </w:tblPrEx>
         <w:trPr>
           <w:cantSplit/>
         </w:trPr>
@@ -7300,12 +7893,6 @@
         </w:tc>
       </w:tr>
       <w:tr>
-        <w:tblPrEx>
-          <w:tblCellMar>
-            <w:top w:w="0" w:type="dxa"/>
-            <w:bottom w:w="0" w:type="dxa"/>
-          </w:tblCellMar>
-        </w:tblPrEx>
         <w:trPr>
           <w:cantSplit/>
         </w:trPr>
@@ -7440,12 +8027,6 @@
         </w:tc>
       </w:tr>
       <w:tr>
-        <w:tblPrEx>
-          <w:tblCellMar>
-            <w:top w:w="0" w:type="dxa"/>
-            <w:bottom w:w="0" w:type="dxa"/>
-          </w:tblCellMar>
-        </w:tblPrEx>
         <w:trPr>
           <w:cantSplit/>
         </w:trPr>
@@ -7580,12 +8161,6 @@
         </w:tc>
       </w:tr>
       <w:tr>
-        <w:tblPrEx>
-          <w:tblCellMar>
-            <w:top w:w="0" w:type="dxa"/>
-            <w:bottom w:w="0" w:type="dxa"/>
-          </w:tblCellMar>
-        </w:tblPrEx>
         <w:trPr>
           <w:trHeight w:val="570"/>
         </w:trPr>
@@ -8037,12 +8612,6 @@
         <w:gridCol w:w="2238"/>
       </w:tblGrid>
       <w:tr>
-        <w:tblPrEx>
-          <w:tblCellMar>
-            <w:top w:w="0" w:type="dxa"/>
-            <w:bottom w:w="0" w:type="dxa"/>
-          </w:tblCellMar>
-        </w:tblPrEx>
         <w:trPr>
           <w:cantSplit/>
         </w:trPr>
@@ -8143,12 +8712,6 @@
         </w:tc>
       </w:tr>
       <w:tr>
-        <w:tblPrEx>
-          <w:tblCellMar>
-            <w:top w:w="0" w:type="dxa"/>
-            <w:bottom w:w="0" w:type="dxa"/>
-          </w:tblCellMar>
-        </w:tblPrEx>
         <w:trPr>
           <w:cantSplit/>
         </w:trPr>
@@ -8266,12 +8829,6 @@
         </w:tc>
       </w:tr>
       <w:tr>
-        <w:tblPrEx>
-          <w:tblCellMar>
-            <w:top w:w="0" w:type="dxa"/>
-            <w:bottom w:w="0" w:type="dxa"/>
-          </w:tblCellMar>
-        </w:tblPrEx>
         <w:trPr>
           <w:cantSplit/>
         </w:trPr>
@@ -8389,12 +8946,6 @@
         </w:tc>
       </w:tr>
       <w:tr>
-        <w:tblPrEx>
-          <w:tblCellMar>
-            <w:top w:w="0" w:type="dxa"/>
-            <w:bottom w:w="0" w:type="dxa"/>
-          </w:tblCellMar>
-        </w:tblPrEx>
         <w:trPr>
           <w:cantSplit/>
         </w:trPr>
@@ -10443,12 +10994,6 @@
         <w:gridCol w:w="2300"/>
       </w:tblGrid>
       <w:tr>
-        <w:tblPrEx>
-          <w:tblCellMar>
-            <w:top w:w="0" w:type="dxa"/>
-            <w:bottom w:w="0" w:type="dxa"/>
-          </w:tblCellMar>
-        </w:tblPrEx>
         <w:trPr>
           <w:cantSplit/>
         </w:trPr>
@@ -10549,12 +11094,6 @@
         </w:tc>
       </w:tr>
       <w:tr>
-        <w:tblPrEx>
-          <w:tblCellMar>
-            <w:top w:w="0" w:type="dxa"/>
-            <w:bottom w:w="0" w:type="dxa"/>
-          </w:tblCellMar>
-        </w:tblPrEx>
         <w:trPr>
           <w:cantSplit/>
         </w:trPr>
@@ -10672,12 +11211,6 @@
         </w:tc>
       </w:tr>
       <w:tr>
-        <w:tblPrEx>
-          <w:tblCellMar>
-            <w:top w:w="0" w:type="dxa"/>
-            <w:bottom w:w="0" w:type="dxa"/>
-          </w:tblCellMar>
-        </w:tblPrEx>
         <w:trPr>
           <w:cantSplit/>
         </w:trPr>
@@ -10795,12 +11328,6 @@
         </w:tc>
       </w:tr>
       <w:tr>
-        <w:tblPrEx>
-          <w:tblCellMar>
-            <w:top w:w="0" w:type="dxa"/>
-            <w:bottom w:w="0" w:type="dxa"/>
-          </w:tblCellMar>
-        </w:tblPrEx>
         <w:trPr>
           <w:cantSplit/>
         </w:trPr>
@@ -10923,12 +11450,6 @@
         </w:tc>
       </w:tr>
       <w:tr>
-        <w:tblPrEx>
-          <w:tblCellMar>
-            <w:top w:w="0" w:type="dxa"/>
-            <w:bottom w:w="0" w:type="dxa"/>
-          </w:tblCellMar>
-        </w:tblPrEx>
         <w:trPr>
           <w:cantSplit/>
         </w:trPr>
@@ -11051,12 +11572,6 @@
         </w:tc>
       </w:tr>
       <w:tr>
-        <w:tblPrEx>
-          <w:tblCellMar>
-            <w:top w:w="0" w:type="dxa"/>
-            <w:bottom w:w="0" w:type="dxa"/>
-          </w:tblCellMar>
-        </w:tblPrEx>
         <w:trPr>
           <w:cantSplit/>
         </w:trPr>
@@ -11179,12 +11694,6 @@
         </w:tc>
       </w:tr>
       <w:tr>
-        <w:tblPrEx>
-          <w:tblCellMar>
-            <w:top w:w="0" w:type="dxa"/>
-            <w:bottom w:w="0" w:type="dxa"/>
-          </w:tblCellMar>
-        </w:tblPrEx>
         <w:trPr>
           <w:cantSplit/>
         </w:trPr>
@@ -11606,12 +12115,6 @@
         <w:gridCol w:w="2238"/>
       </w:tblGrid>
       <w:tr>
-        <w:tblPrEx>
-          <w:tblCellMar>
-            <w:top w:w="0" w:type="dxa"/>
-            <w:bottom w:w="0" w:type="dxa"/>
-          </w:tblCellMar>
-        </w:tblPrEx>
         <w:trPr>
           <w:cantSplit/>
         </w:trPr>
@@ -11712,12 +12215,6 @@
         </w:tc>
       </w:tr>
       <w:tr>
-        <w:tblPrEx>
-          <w:tblCellMar>
-            <w:top w:w="0" w:type="dxa"/>
-            <w:bottom w:w="0" w:type="dxa"/>
-          </w:tblCellMar>
-        </w:tblPrEx>
         <w:trPr>
           <w:cantSplit/>
         </w:trPr>
@@ -11835,12 +12332,6 @@
         </w:tc>
       </w:tr>
       <w:tr>
-        <w:tblPrEx>
-          <w:tblCellMar>
-            <w:top w:w="0" w:type="dxa"/>
-            <w:bottom w:w="0" w:type="dxa"/>
-          </w:tblCellMar>
-        </w:tblPrEx>
         <w:trPr>
           <w:cantSplit/>
         </w:trPr>
@@ -11958,12 +12449,6 @@
         </w:tc>
       </w:tr>
       <w:tr>
-        <w:tblPrEx>
-          <w:tblCellMar>
-            <w:top w:w="0" w:type="dxa"/>
-            <w:bottom w:w="0" w:type="dxa"/>
-          </w:tblCellMar>
-        </w:tblPrEx>
         <w:trPr>
           <w:cantSplit/>
         </w:trPr>
@@ -12086,12 +12571,6 @@
         </w:tc>
       </w:tr>
       <w:tr>
-        <w:tblPrEx>
-          <w:tblCellMar>
-            <w:top w:w="0" w:type="dxa"/>
-            <w:bottom w:w="0" w:type="dxa"/>
-          </w:tblCellMar>
-        </w:tblPrEx>
         <w:trPr>
           <w:cantSplit/>
         </w:trPr>
@@ -12214,12 +12693,6 @@
         </w:tc>
       </w:tr>
       <w:tr>
-        <w:tblPrEx>
-          <w:tblCellMar>
-            <w:top w:w="0" w:type="dxa"/>
-            <w:bottom w:w="0" w:type="dxa"/>
-          </w:tblCellMar>
-        </w:tblPrEx>
         <w:trPr>
           <w:cantSplit/>
         </w:trPr>
@@ -12342,12 +12815,6 @@
         </w:tc>
       </w:tr>
       <w:tr>
-        <w:tblPrEx>
-          <w:tblCellMar>
-            <w:top w:w="0" w:type="dxa"/>
-            <w:bottom w:w="0" w:type="dxa"/>
-          </w:tblCellMar>
-        </w:tblPrEx>
         <w:trPr>
           <w:cantSplit/>
         </w:trPr>
@@ -12794,12 +13261,6 @@
         <w:gridCol w:w="2238"/>
       </w:tblGrid>
       <w:tr>
-        <w:tblPrEx>
-          <w:tblCellMar>
-            <w:top w:w="0" w:type="dxa"/>
-            <w:bottom w:w="0" w:type="dxa"/>
-          </w:tblCellMar>
-        </w:tblPrEx>
         <w:trPr>
           <w:cantSplit/>
         </w:trPr>
@@ -12900,12 +13361,6 @@
         </w:tc>
       </w:tr>
       <w:tr>
-        <w:tblPrEx>
-          <w:tblCellMar>
-            <w:top w:w="0" w:type="dxa"/>
-            <w:bottom w:w="0" w:type="dxa"/>
-          </w:tblCellMar>
-        </w:tblPrEx>
         <w:trPr>
           <w:cantSplit/>
         </w:trPr>
@@ -13023,12 +13478,6 @@
         </w:tc>
       </w:tr>
       <w:tr>
-        <w:tblPrEx>
-          <w:tblCellMar>
-            <w:top w:w="0" w:type="dxa"/>
-            <w:bottom w:w="0" w:type="dxa"/>
-          </w:tblCellMar>
-        </w:tblPrEx>
         <w:trPr>
           <w:cantSplit/>
         </w:trPr>
@@ -13146,12 +13595,6 @@
         </w:tc>
       </w:tr>
       <w:tr>
-        <w:tblPrEx>
-          <w:tblCellMar>
-            <w:top w:w="0" w:type="dxa"/>
-            <w:bottom w:w="0" w:type="dxa"/>
-          </w:tblCellMar>
-        </w:tblPrEx>
         <w:trPr>
           <w:cantSplit/>
         </w:trPr>
@@ -14308,6 +14751,44 @@
       <w:color w:val="808080"/>
     </w:rPr>
   </w:style>
+  <w:style w:type="paragraph" w:styleId="a8">
+    <w:name w:val="endnote text"/>
+    <w:basedOn w:val="a"/>
+    <w:link w:val="a9"/>
+    <w:uiPriority w:val="99"/>
+    <w:semiHidden/>
+    <w:unhideWhenUsed/>
+    <w:rsid w:val="006E1DBD"/>
+    <w:rPr>
+      <w:rFonts w:cs="Mangal"/>
+      <w:sz w:val="20"/>
+      <w:szCs w:val="18"/>
+    </w:rPr>
+  </w:style>
+  <w:style w:type="character" w:customStyle="1" w:styleId="a9">
+    <w:name w:val="Текст концевой сноски Знак"/>
+    <w:basedOn w:val="a0"/>
+    <w:link w:val="a8"/>
+    <w:uiPriority w:val="99"/>
+    <w:semiHidden/>
+    <w:rsid w:val="006E1DBD"/>
+    <w:rPr>
+      <w:rFonts w:cs="Mangal"/>
+      <w:sz w:val="20"/>
+      <w:szCs w:val="18"/>
+    </w:rPr>
+  </w:style>
+  <w:style w:type="character" w:styleId="aa">
+    <w:name w:val="endnote reference"/>
+    <w:basedOn w:val="a0"/>
+    <w:uiPriority w:val="99"/>
+    <w:semiHidden/>
+    <w:unhideWhenUsed/>
+    <w:rsid w:val="006E1DBD"/>
+    <w:rPr>
+      <w:vertAlign w:val="superscript"/>
+    </w:rPr>
+  </w:style>
 </w:styles>
 </file>
 

</xml_diff>

<commit_message>
progress in pkt 2 still have some problems
</commit_message>
<xml_diff>
--- a/Lab3/LELA1_LAB3_Rah_Sal.docx
+++ b/Lab3/LELA1_LAB3_Rah_Sal.docx
@@ -2038,6 +2038,7 @@
                 <w:rPr>
                   <w:rFonts w:ascii="Cambria Math" w:hAnsi="Cambria Math" w:cstheme="minorHAnsi"/>
                   <w:i/>
+                  <w:highlight w:val="yellow"/>
                 </w:rPr>
               </m:ctrlPr>
             </m:sSubPr>
@@ -2045,6 +2046,7 @@
               <m:r>
                 <w:rPr>
                   <w:rFonts w:ascii="Cambria Math" w:hAnsi="Cambria Math" w:cstheme="minorHAnsi"/>
+                  <w:highlight w:val="yellow"/>
                 </w:rPr>
                 <m:t>U</m:t>
               </m:r>
@@ -2053,6 +2055,7 @@
               <m:r>
                 <w:rPr>
                   <w:rFonts w:ascii="Cambria Math" w:hAnsi="Cambria Math" w:cstheme="minorHAnsi"/>
+                  <w:highlight w:val="yellow"/>
                 </w:rPr>
                 <m:t>E</m:t>
               </m:r>
@@ -2061,6 +2064,7 @@
           <m:r>
             <w:rPr>
               <w:rFonts w:ascii="Cambria Math" w:hAnsi="Cambria Math" w:cstheme="minorHAnsi"/>
+              <w:highlight w:val="yellow"/>
             </w:rPr>
             <m:t>=</m:t>
           </m:r>
@@ -2070,6 +2074,7 @@
                 <w:rPr>
                   <w:rFonts w:ascii="Cambria Math" w:hAnsi="Cambria Math" w:cstheme="minorHAnsi"/>
                   <w:i/>
+                  <w:highlight w:val="yellow"/>
                 </w:rPr>
               </m:ctrlPr>
             </m:sSubPr>
@@ -2077,6 +2082,7 @@
               <m:r>
                 <w:rPr>
                   <w:rFonts w:ascii="Cambria Math" w:hAnsi="Cambria Math" w:cstheme="minorHAnsi"/>
+                  <w:highlight w:val="yellow"/>
                 </w:rPr>
                 <m:t>U</m:t>
               </m:r>
@@ -2085,14 +2091,16 @@
               <m:r>
                 <w:rPr>
                   <w:rFonts w:ascii="Cambria Math" w:hAnsi="Cambria Math" w:cstheme="minorHAnsi"/>
-                </w:rPr>
-                <m:t>2</m:t>
+                  <w:highlight w:val="yellow"/>
+                </w:rPr>
+                <m:t>1</m:t>
               </m:r>
             </m:sub>
           </m:sSub>
           <m:r>
             <w:rPr>
               <w:rFonts w:ascii="Cambria Math" w:hAnsi="Cambria Math" w:cstheme="minorHAnsi"/>
+              <w:highlight w:val="yellow"/>
             </w:rPr>
             <m:t>+</m:t>
           </m:r>
@@ -2102,6 +2110,7 @@
                 <w:rPr>
                   <w:rFonts w:ascii="Cambria Math" w:hAnsi="Cambria Math" w:cstheme="minorHAnsi"/>
                   <w:i/>
+                  <w:highlight w:val="yellow"/>
                 </w:rPr>
               </m:ctrlPr>
             </m:sSubPr>
@@ -2109,6 +2118,7 @@
               <m:r>
                 <w:rPr>
                   <w:rFonts w:ascii="Cambria Math" w:hAnsi="Cambria Math" w:cstheme="minorHAnsi"/>
+                  <w:highlight w:val="yellow"/>
                 </w:rPr>
                 <m:t>U</m:t>
               </m:r>
@@ -2117,29 +2127,69 @@
               <m:r>
                 <w:rPr>
                   <w:rFonts w:ascii="Cambria Math" w:hAnsi="Cambria Math" w:cstheme="minorHAnsi"/>
-                </w:rPr>
-                <m:t>R4</m:t>
+                  <w:highlight w:val="yellow"/>
+                  <w:lang w:val="en-US"/>
+                </w:rPr>
+                <m:t>CE</m:t>
               </m:r>
             </m:sub>
           </m:sSub>
           <m:r>
             <w:rPr>
               <w:rFonts w:ascii="Cambria Math" w:hAnsi="Cambria Math" w:cstheme="minorHAnsi"/>
+              <w:highlight w:val="yellow"/>
             </w:rPr>
-            <m:t xml:space="preserve"> = -9,00 V+6</m:t>
+            <m:t xml:space="preserve"> = 4,00</m:t>
           </m:r>
           <m:r>
             <w:rPr>
               <w:rFonts w:ascii="Cambria Math" w:hAnsi="Cambria Math" w:cstheme="minorHAnsi"/>
-              <w:lang w:val="en-US"/>
+              <w:highlight w:val="yellow"/>
             </w:rPr>
-            <m:t>,72</m:t>
+            <m:t xml:space="preserve"> V</m:t>
           </m:r>
           <m:r>
             <w:rPr>
               <w:rFonts w:ascii="Cambria Math" w:hAnsi="Cambria Math" w:cstheme="minorHAnsi"/>
+              <w:highlight w:val="yellow"/>
             </w:rPr>
-            <m:t xml:space="preserve"> V =- 2,28 V</m:t>
+            <m:t>-</m:t>
+          </m:r>
+          <m:r>
+            <w:rPr>
+              <w:rFonts w:ascii="Cambria Math" w:hAnsi="Cambria Math" w:cstheme="minorHAnsi"/>
+              <w:highlight w:val="yellow"/>
+            </w:rPr>
+            <m:t>6</m:t>
+          </m:r>
+          <m:r>
+            <w:rPr>
+              <w:rFonts w:ascii="Cambria Math" w:hAnsi="Cambria Math" w:cstheme="minorHAnsi"/>
+              <w:highlight w:val="yellow"/>
+              <w:lang w:val="en-US"/>
+            </w:rPr>
+            <m:t>,19</m:t>
+          </m:r>
+          <m:r>
+            <w:rPr>
+              <w:rFonts w:ascii="Cambria Math" w:hAnsi="Cambria Math" w:cstheme="minorHAnsi"/>
+              <w:highlight w:val="yellow"/>
+            </w:rPr>
+            <m:t xml:space="preserve"> V</m:t>
+          </m:r>
+          <m:r>
+            <w:rPr>
+              <w:rFonts w:ascii="Cambria Math" w:hAnsi="Cambria Math" w:cstheme="minorHAnsi"/>
+              <w:highlight w:val="yellow"/>
+            </w:rPr>
+            <m:t xml:space="preserve"> =- 2,19</m:t>
+          </m:r>
+          <m:r>
+            <w:rPr>
+              <w:rFonts w:ascii="Cambria Math" w:hAnsi="Cambria Math" w:cstheme="minorHAnsi"/>
+              <w:highlight w:val="yellow"/>
+            </w:rPr>
+            <m:t xml:space="preserve"> V</m:t>
           </m:r>
         </m:oMath>
       </m:oMathPara>
@@ -2172,6 +2222,7 @@
                 <w:rPr>
                   <w:rFonts w:ascii="Cambria Math" w:hAnsi="Cambria Math" w:cstheme="minorHAnsi"/>
                   <w:i/>
+                  <w:highlight w:val="yellow"/>
                 </w:rPr>
               </m:ctrlPr>
             </m:sSubPr>
@@ -2179,6 +2230,7 @@
               <m:r>
                 <w:rPr>
                   <w:rFonts w:ascii="Cambria Math" w:hAnsi="Cambria Math" w:cstheme="minorHAnsi"/>
+                  <w:highlight w:val="yellow"/>
                 </w:rPr>
                 <m:t>U</m:t>
               </m:r>
@@ -2187,6 +2239,7 @@
               <m:r>
                 <w:rPr>
                   <w:rFonts w:ascii="Cambria Math" w:hAnsi="Cambria Math" w:cstheme="minorHAnsi"/>
+                  <w:highlight w:val="yellow"/>
                 </w:rPr>
                 <m:t>BE</m:t>
               </m:r>
@@ -2195,6 +2248,7 @@
           <m:r>
             <w:rPr>
               <w:rFonts w:ascii="Cambria Math" w:hAnsi="Cambria Math" w:cstheme="minorHAnsi"/>
+              <w:highlight w:val="yellow"/>
             </w:rPr>
             <m:t xml:space="preserve">= </m:t>
           </m:r>
@@ -2204,6 +2258,7 @@
                 <w:rPr>
                   <w:rFonts w:ascii="Cambria Math" w:hAnsi="Cambria Math" w:cstheme="minorHAnsi"/>
                   <w:i/>
+                  <w:highlight w:val="yellow"/>
                 </w:rPr>
               </m:ctrlPr>
             </m:dPr>
@@ -2214,6 +2269,7 @@
                     <w:rPr>
                       <w:rFonts w:ascii="Cambria Math" w:hAnsi="Cambria Math" w:cstheme="minorHAnsi"/>
                       <w:i/>
+                      <w:highlight w:val="yellow"/>
                     </w:rPr>
                   </m:ctrlPr>
                 </m:sSubPr>
@@ -2221,6 +2277,7 @@
                   <m:r>
                     <w:rPr>
                       <w:rFonts w:ascii="Cambria Math" w:hAnsi="Cambria Math" w:cstheme="minorHAnsi"/>
+                      <w:highlight w:val="yellow"/>
                     </w:rPr>
                     <m:t>U</m:t>
                   </m:r>
@@ -2229,6 +2286,7 @@
                   <m:r>
                     <w:rPr>
                       <w:rFonts w:ascii="Cambria Math" w:hAnsi="Cambria Math" w:cstheme="minorHAnsi"/>
+                      <w:highlight w:val="yellow"/>
                     </w:rPr>
                     <m:t>B</m:t>
                   </m:r>
@@ -2237,6 +2295,7 @@
               <m:r>
                 <w:rPr>
                   <w:rFonts w:ascii="Cambria Math" w:hAnsi="Cambria Math" w:cstheme="minorHAnsi"/>
+                  <w:highlight w:val="yellow"/>
                 </w:rPr>
                 <m:t>-</m:t>
               </m:r>
@@ -2246,6 +2305,7 @@
                     <w:rPr>
                       <w:rFonts w:ascii="Cambria Math" w:hAnsi="Cambria Math" w:cstheme="minorHAnsi"/>
                       <w:i/>
+                      <w:highlight w:val="yellow"/>
                     </w:rPr>
                   </m:ctrlPr>
                 </m:sSubPr>
@@ -2253,6 +2313,7 @@
                   <m:r>
                     <w:rPr>
                       <w:rFonts w:ascii="Cambria Math" w:hAnsi="Cambria Math" w:cstheme="minorHAnsi"/>
+                      <w:highlight w:val="yellow"/>
                     </w:rPr>
                     <m:t>U</m:t>
                   </m:r>
@@ -2261,6 +2322,7 @@
                   <m:r>
                     <w:rPr>
                       <w:rFonts w:ascii="Cambria Math" w:hAnsi="Cambria Math" w:cstheme="minorHAnsi"/>
+                      <w:highlight w:val="yellow"/>
                     </w:rPr>
                     <m:t>E</m:t>
                   </m:r>
@@ -2271,6 +2333,7 @@
           <m:r>
             <w:rPr>
               <w:rFonts w:ascii="Cambria Math" w:hAnsi="Cambria Math" w:cstheme="minorHAnsi"/>
+              <w:highlight w:val="yellow"/>
             </w:rPr>
             <m:t>=-1,52 V -</m:t>
           </m:r>
@@ -2280,6 +2343,7 @@
                 <w:rPr>
                   <w:rFonts w:ascii="Cambria Math" w:hAnsi="Cambria Math" w:cstheme="minorHAnsi"/>
                   <w:i/>
+                  <w:highlight w:val="yellow"/>
                 </w:rPr>
               </m:ctrlPr>
             </m:dPr>
@@ -2287,16 +2351,39 @@
               <m:r>
                 <w:rPr>
                   <w:rFonts w:ascii="Cambria Math" w:hAnsi="Cambria Math" w:cstheme="minorHAnsi"/>
-                </w:rPr>
-                <m:t>-2,28 V</m:t>
+                  <w:highlight w:val="yellow"/>
+                </w:rPr>
+                <m:t>-</m:t>
+              </m:r>
+              <m:r>
+                <w:rPr>
+                  <w:rFonts w:ascii="Cambria Math" w:hAnsi="Cambria Math" w:cstheme="minorHAnsi"/>
+                  <w:highlight w:val="yellow"/>
+                </w:rPr>
+                <m:t>2,19</m:t>
+              </m:r>
+              <m:r>
+                <w:rPr>
+                  <w:rFonts w:ascii="Cambria Math" w:hAnsi="Cambria Math" w:cstheme="minorHAnsi"/>
+                  <w:highlight w:val="yellow"/>
+                </w:rPr>
+                <m:t xml:space="preserve"> V</m:t>
               </m:r>
             </m:e>
           </m:d>
           <m:r>
             <w:rPr>
               <w:rFonts w:ascii="Cambria Math" w:hAnsi="Cambria Math" w:cstheme="minorHAnsi"/>
+              <w:highlight w:val="yellow"/>
             </w:rPr>
-            <m:t>=0,76 V</m:t>
+            <m:t>=0,67</m:t>
+          </m:r>
+          <m:r>
+            <w:rPr>
+              <w:rFonts w:ascii="Cambria Math" w:hAnsi="Cambria Math" w:cstheme="minorHAnsi"/>
+              <w:highlight w:val="yellow"/>
+            </w:rPr>
+            <m:t> V</m:t>
           </m:r>
         </m:oMath>
       </m:oMathPara>
@@ -2521,7 +2608,13 @@
             <w:rPr>
               <w:rFonts w:ascii="Cambria Math" w:hAnsi="Cambria Math" w:cstheme="minorHAnsi"/>
             </w:rPr>
-            <m:t xml:space="preserve"> =  5,16 mA</m:t>
+            <m:t xml:space="preserve"> =  5,17</m:t>
+          </m:r>
+          <m:r>
+            <w:rPr>
+              <w:rFonts w:ascii="Cambria Math" w:hAnsi="Cambria Math" w:cstheme="minorHAnsi"/>
+            </w:rPr>
+            <m:t xml:space="preserve"> mA</m:t>
           </m:r>
         </m:oMath>
       </m:oMathPara>
@@ -5148,7 +5241,7 @@
             <w:rPr>
               <w:rFonts w:ascii="Cambria Math" w:hAnsi="Cambria Math"/>
             </w:rPr>
-            <m:t>2,28</m:t>
+            <m:t>2,19</m:t>
           </m:r>
           <m:r>
             <w:rPr>
@@ -5301,7 +5394,7 @@
             <w:rPr>
               <w:rFonts w:ascii="Cambria Math" w:hAnsi="Cambria Math"/>
             </w:rPr>
-            <m:t>,28</m:t>
+            <m:t>,19</m:t>
           </m:r>
           <m:r>
             <w:rPr>
@@ -5332,7 +5425,7 @@
             <w:rPr>
               <w:rFonts w:ascii="Cambria Math" w:hAnsi="Cambria Math"/>
             </w:rPr>
-            <m:t>=0,75</m:t>
+            <m:t>=0,84</m:t>
           </m:r>
           <m:r>
             <w:rPr>
@@ -5572,7 +5665,7 @@
             <w:rPr>
               <w:rFonts w:ascii="Cambria Math" w:hAnsi="Cambria Math"/>
             </w:rPr>
-            <m:t xml:space="preserve"> = 5,16</m:t>
+            <m:t xml:space="preserve"> = 5,17</m:t>
           </m:r>
           <m:r>
             <w:rPr>
@@ -5626,7 +5719,7 @@
             <w:rPr>
               <w:rFonts w:ascii="Cambria Math" w:hAnsi="Cambria Math"/>
             </w:rPr>
-            <m:t xml:space="preserve"> = 0,89</m:t>
+            <m:t xml:space="preserve"> = 0,90</m:t>
           </m:r>
           <m:r>
             <w:rPr>
@@ -5654,14 +5747,17 @@
           <w:rFonts w:ascii="Calibri" w:hAnsi="Calibri"/>
           <w:i/>
           <w:iCs/>
-        </w:rPr>
-      </w:pPr>
-      <w:r>
-        <w:rPr>
-          <w:rFonts w:ascii="Calibri" w:hAnsi="Calibri"/>
-          <w:i/>
-          <w:iCs/>
-          <w:highlight w:val="red"/>
+          <w:highlight w:val="yellow"/>
+        </w:rPr>
+      </w:pPr>
+      <w:bookmarkStart w:id="0" w:name="_GoBack"/>
+      <w:bookmarkEnd w:id="0"/>
+      <w:r>
+        <w:rPr>
+          <w:rFonts w:ascii="Calibri" w:hAnsi="Calibri"/>
+          <w:i/>
+          <w:iCs/>
+          <w:highlight w:val="yellow"/>
         </w:rPr>
         <w:t>Wartość oczekiwana</w:t>
       </w:r>
@@ -5670,7 +5766,7 @@
           <w:rFonts w:ascii="Calibri" w:hAnsi="Calibri"/>
           <w:i/>
           <w:iCs/>
-          <w:highlight w:val="red"/>
+          <w:highlight w:val="yellow"/>
         </w:rPr>
         <w:t xml:space="preserve"> różni się od wartości praktycznej o</w:t>
       </w:r>
@@ -5678,7 +5774,7 @@
         <m:r>
           <w:rPr>
             <w:rFonts w:ascii="Cambria Math" w:hAnsi="Cambria Math"/>
-            <w:highlight w:val="red"/>
+            <w:highlight w:val="yellow"/>
           </w:rPr>
           <m:t xml:space="preserve"> ~</m:t>
         </m:r>
@@ -5688,101 +5784,120 @@
           <w:rFonts w:ascii="Calibri" w:hAnsi="Calibri"/>
           <w:i/>
           <w:iCs/>
-          <w:highlight w:val="red"/>
-        </w:rPr>
-        <w:t>15</w:t>
-      </w:r>
-      <w:r>
-        <w:rPr>
-          <w:rFonts w:ascii="Calibri" w:hAnsi="Calibri"/>
-          <w:i/>
-          <w:iCs/>
-          <w:highlight w:val="red"/>
-        </w:rPr>
-        <w:t xml:space="preserve">%, </w:t>
-      </w:r>
-      <w:r>
-        <w:rPr>
-          <w:rFonts w:ascii="Calibri" w:hAnsi="Calibri"/>
-          <w:i/>
-          <w:iCs/>
-          <w:highlight w:val="red"/>
-        </w:rPr>
-        <w:t>przy dokładniejszej analizi</w:t>
-      </w:r>
-      <w:r>
-        <w:rPr>
-          <w:rFonts w:ascii="Calibri" w:hAnsi="Calibri"/>
-          <w:i/>
-          <w:iCs/>
-          <w:highlight w:val="red"/>
-        </w:rPr>
-        <w:t>e zauważono, że taki błą</w:t>
-      </w:r>
-      <w:r>
-        <w:rPr>
-          <w:rFonts w:ascii="Calibri" w:hAnsi="Calibri"/>
-          <w:i/>
-          <w:iCs/>
-          <w:highlight w:val="red"/>
-        </w:rPr>
-        <w:t>d może dać</w:t>
-      </w:r>
-      <w:r>
-        <w:rPr>
-          <w:rFonts w:ascii="Calibri" w:hAnsi="Calibri"/>
-          <w:i/>
-          <w:iCs/>
-          <w:highlight w:val="red"/>
-        </w:rPr>
-        <w:t xml:space="preserve"> rozrzut wartości U</w:t>
-      </w:r>
-      <w:r>
-        <w:rPr>
-          <w:rFonts w:ascii="Calibri" w:hAnsi="Calibri"/>
-          <w:i/>
-          <w:iCs/>
-          <w:highlight w:val="red"/>
-          <w:vertAlign w:val="subscript"/>
-        </w:rPr>
-        <w:t xml:space="preserve">E </w:t>
-      </w:r>
-      <w:r>
-        <w:rPr>
-          <w:rFonts w:ascii="Calibri" w:hAnsi="Calibri"/>
-          <w:i/>
-          <w:iCs/>
-          <w:highlight w:val="red"/>
-        </w:rPr>
-        <w:t>o</w:t>
-      </w:r>
-      <w:r>
-        <w:rPr>
-          <w:rFonts w:ascii="Calibri" w:hAnsi="Calibri"/>
-          <w:i/>
-          <w:iCs/>
-          <w:highlight w:val="red"/>
-          <w:vertAlign w:val="subscript"/>
+          <w:highlight w:val="yellow"/>
+        </w:rPr>
+        <w:t>6</w:t>
+      </w:r>
+      <w:r>
+        <w:rPr>
+          <w:rFonts w:ascii="Calibri" w:hAnsi="Calibri"/>
+          <w:i/>
+          <w:iCs/>
+          <w:highlight w:val="yellow"/>
+        </w:rPr>
+        <w:t>%.</w:t>
+      </w:r>
+      <w:r>
+        <w:rPr>
+          <w:rFonts w:ascii="Calibri" w:hAnsi="Calibri"/>
+          <w:i/>
+          <w:iCs/>
+          <w:highlight w:val="yellow"/>
         </w:rPr>
         <w:t xml:space="preserve"> </w:t>
       </w:r>
-      <m:oMath>
-        <m:r>
-          <w:rPr>
-            <w:rFonts w:ascii="Cambria Math" w:hAnsi="Cambria Math"/>
-            <w:highlight w:val="red"/>
-          </w:rPr>
-          <m:t>~</m:t>
-        </m:r>
-      </m:oMath>
-      <w:r>
-        <w:rPr>
-          <w:rFonts w:ascii="Calibri" w:hAnsi="Calibri"/>
-          <w:i/>
-          <w:iCs/>
-          <w:highlight w:val="red"/>
-        </w:rPr>
-        <w:t>6%</w:t>
+      <w:r>
+        <w:rPr>
+          <w:rFonts w:ascii="Calibri" w:hAnsi="Calibri"/>
+          <w:i/>
+          <w:iCs/>
+          <w:highlight w:val="yellow"/>
+        </w:rPr>
+        <w:t>Najprawdopodobniej wynika to z różnicy pomiędzy zmierz</w:t>
+      </w:r>
+      <w:r>
+        <w:rPr>
+          <w:rFonts w:ascii="Calibri" w:hAnsi="Calibri"/>
+          <w:i/>
+          <w:iCs/>
+          <w:highlight w:val="yellow"/>
+        </w:rPr>
+        <w:t xml:space="preserve">onym a teoretycznie wyznaczonym </w:t>
+      </w:r>
+      <w:r>
+        <w:rPr>
+          <w:rFonts w:ascii="Calibri" w:hAnsi="Calibri"/>
+          <w:i/>
+          <w:iCs/>
+          <w:highlight w:val="yellow"/>
+        </w:rPr>
+        <w:t>punktem pracy.</w:t>
+      </w:r>
+    </w:p>
+    <w:p>
+      <w:pPr>
+        <w:pStyle w:val="Standard"/>
+        <w:rPr>
+          <w:rFonts w:ascii="Calibri" w:hAnsi="Calibri"/>
+          <w:i/>
+          <w:iCs/>
+          <w:highlight w:val="yellow"/>
+        </w:rPr>
+      </w:pPr>
+      <w:r>
+        <w:rPr>
+          <w:rFonts w:ascii="Calibri" w:hAnsi="Calibri"/>
+          <w:i/>
+          <w:iCs/>
+          <w:highlight w:val="yellow"/>
+        </w:rPr>
+        <w:t>Aby zwiększyć</w:t>
+      </w:r>
+      <w:r>
+        <w:rPr>
+          <w:rFonts w:ascii="Calibri" w:hAnsi="Calibri"/>
+          <w:i/>
+          <w:iCs/>
+          <w:highlight w:val="yellow"/>
+        </w:rPr>
+        <w:t xml:space="preserve"> maksymalną amplitudę sygnału wyjściowego</w:t>
+      </w:r>
+      <w:r>
+        <w:rPr>
+          <w:rFonts w:ascii="Calibri" w:hAnsi="Calibri"/>
+          <w:i/>
+          <w:iCs/>
+          <w:highlight w:val="yellow"/>
+        </w:rPr>
+        <w:t xml:space="preserve"> trzeba zmniejszyć</w:t>
+      </w:r>
+      <w:r>
+        <w:rPr>
+          <w:rFonts w:ascii="Calibri" w:hAnsi="Calibri"/>
+          <w:i/>
+          <w:iCs/>
+          <w:highlight w:val="yellow"/>
+        </w:rPr>
+        <w:t xml:space="preserve"> rezystor R4 pilnując,</w:t>
+      </w:r>
+    </w:p>
+    <w:p>
+      <w:pPr>
+        <w:pStyle w:val="Standard"/>
+        <w:rPr>
+          <w:rFonts w:ascii="Calibri" w:hAnsi="Calibri"/>
+          <w:i/>
+          <w:iCs/>
+        </w:rPr>
+      </w:pPr>
+      <w:r>
+        <w:rPr>
+          <w:rFonts w:ascii="Calibri" w:hAnsi="Calibri"/>
+          <w:i/>
+          <w:iCs/>
+          <w:highlight w:val="yellow"/>
+        </w:rPr>
+        <w:t>aby tranzystor nie wyszedł ze stanu aktywnego.</w:t>
       </w:r>
     </w:p>
     <w:p>
@@ -5812,6 +5927,7 @@
           <w:bCs/>
           <w:sz w:val="28"/>
           <w:szCs w:val="28"/>
+          <w:lang w:val="ru-RU"/>
         </w:rPr>
       </w:pPr>
       <w:r>
@@ -5832,8 +5948,6 @@
         </w:rPr>
         <w:t xml:space="preserve"> Parametry małosygnałowe wtórnika emiterowego</w:t>
       </w:r>
-      <w:bookmarkStart w:id="0" w:name="_GoBack"/>
-      <w:bookmarkEnd w:id="0"/>
     </w:p>
     <w:p>
       <w:pPr>
@@ -5884,6 +5998,7 @@
           <w:i/>
           <w:iCs/>
         </w:rPr>
+        <w:lastRenderedPageBreak/>
         <w:t>E</w:t>
       </w:r>
       <w:r>
@@ -14789,6 +14904,45 @@
       <w:vertAlign w:val="superscript"/>
     </w:rPr>
   </w:style>
+  <w:style w:type="paragraph" w:styleId="ab">
+    <w:name w:val="footer"/>
+    <w:basedOn w:val="a"/>
+    <w:link w:val="ac"/>
+    <w:uiPriority w:val="99"/>
+    <w:semiHidden/>
+    <w:unhideWhenUsed/>
+    <w:rsid w:val="00D839B1"/>
+    <w:pPr>
+      <w:tabs>
+        <w:tab w:val="center" w:pos="4677"/>
+        <w:tab w:val="right" w:pos="9355"/>
+      </w:tabs>
+    </w:pPr>
+    <w:rPr>
+      <w:rFonts w:cs="Mangal"/>
+      <w:szCs w:val="21"/>
+    </w:rPr>
+  </w:style>
+  <w:style w:type="character" w:customStyle="1" w:styleId="ac">
+    <w:name w:val="Нижний колонтитул Знак"/>
+    <w:basedOn w:val="a0"/>
+    <w:link w:val="ab"/>
+    <w:uiPriority w:val="99"/>
+    <w:semiHidden/>
+    <w:rsid w:val="00D839B1"/>
+    <w:rPr>
+      <w:rFonts w:cs="Mangal"/>
+      <w:szCs w:val="21"/>
+    </w:rPr>
+  </w:style>
+  <w:style w:type="character" w:styleId="ad">
+    <w:name w:val="page number"/>
+    <w:basedOn w:val="a0"/>
+    <w:uiPriority w:val="99"/>
+    <w:semiHidden/>
+    <w:unhideWhenUsed/>
+    <w:rsid w:val="00D839B1"/>
+  </w:style>
 </w:styles>
 </file>
 

</xml_diff>

<commit_message>
finish pkt 2 pkt 3 in progress
</commit_message>
<xml_diff>
--- a/Lab3/LELA1_LAB3_Rah_Sal.docx
+++ b/Lab3/LELA1_LAB3_Rah_Sal.docx
@@ -2139,28 +2139,7 @@
               <w:rFonts w:ascii="Cambria Math" w:hAnsi="Cambria Math" w:cstheme="minorHAnsi"/>
               <w:highlight w:val="yellow"/>
             </w:rPr>
-            <m:t xml:space="preserve"> = 4,00</m:t>
-          </m:r>
-          <m:r>
-            <w:rPr>
-              <w:rFonts w:ascii="Cambria Math" w:hAnsi="Cambria Math" w:cstheme="minorHAnsi"/>
-              <w:highlight w:val="yellow"/>
-            </w:rPr>
-            <m:t xml:space="preserve"> V</m:t>
-          </m:r>
-          <m:r>
-            <w:rPr>
-              <w:rFonts w:ascii="Cambria Math" w:hAnsi="Cambria Math" w:cstheme="minorHAnsi"/>
-              <w:highlight w:val="yellow"/>
-            </w:rPr>
-            <m:t>-</m:t>
-          </m:r>
-          <m:r>
-            <w:rPr>
-              <w:rFonts w:ascii="Cambria Math" w:hAnsi="Cambria Math" w:cstheme="minorHAnsi"/>
-              <w:highlight w:val="yellow"/>
-            </w:rPr>
-            <m:t>6</m:t>
+            <m:t xml:space="preserve"> = 4,00 V-6</m:t>
           </m:r>
           <m:r>
             <w:rPr>
@@ -2175,21 +2154,7 @@
               <w:rFonts w:ascii="Cambria Math" w:hAnsi="Cambria Math" w:cstheme="minorHAnsi"/>
               <w:highlight w:val="yellow"/>
             </w:rPr>
-            <m:t xml:space="preserve"> V</m:t>
-          </m:r>
-          <m:r>
-            <w:rPr>
-              <w:rFonts w:ascii="Cambria Math" w:hAnsi="Cambria Math" w:cstheme="minorHAnsi"/>
-              <w:highlight w:val="yellow"/>
-            </w:rPr>
-            <m:t xml:space="preserve"> =- 2,19</m:t>
-          </m:r>
-          <m:r>
-            <w:rPr>
-              <w:rFonts w:ascii="Cambria Math" w:hAnsi="Cambria Math" w:cstheme="minorHAnsi"/>
-              <w:highlight w:val="yellow"/>
-            </w:rPr>
-            <m:t xml:space="preserve"> V</m:t>
+            <m:t xml:space="preserve"> V =- 2,19 V</m:t>
           </m:r>
         </m:oMath>
       </m:oMathPara>
@@ -2353,21 +2318,7 @@
                   <w:rFonts w:ascii="Cambria Math" w:hAnsi="Cambria Math" w:cstheme="minorHAnsi"/>
                   <w:highlight w:val="yellow"/>
                 </w:rPr>
-                <m:t>-</m:t>
-              </m:r>
-              <m:r>
-                <w:rPr>
-                  <w:rFonts w:ascii="Cambria Math" w:hAnsi="Cambria Math" w:cstheme="minorHAnsi"/>
-                  <w:highlight w:val="yellow"/>
-                </w:rPr>
-                <m:t>2,19</m:t>
-              </m:r>
-              <m:r>
-                <w:rPr>
-                  <w:rFonts w:ascii="Cambria Math" w:hAnsi="Cambria Math" w:cstheme="minorHAnsi"/>
-                  <w:highlight w:val="yellow"/>
-                </w:rPr>
-                <m:t xml:space="preserve"> V</m:t>
+                <m:t>-2,19 V</m:t>
               </m:r>
             </m:e>
           </m:d>
@@ -2376,14 +2327,7 @@
               <w:rFonts w:ascii="Cambria Math" w:hAnsi="Cambria Math" w:cstheme="minorHAnsi"/>
               <w:highlight w:val="yellow"/>
             </w:rPr>
-            <m:t>=0,67</m:t>
-          </m:r>
-          <m:r>
-            <w:rPr>
-              <w:rFonts w:ascii="Cambria Math" w:hAnsi="Cambria Math" w:cstheme="minorHAnsi"/>
-              <w:highlight w:val="yellow"/>
-            </w:rPr>
-            <m:t> V</m:t>
+            <m:t>=0,67 V</m:t>
           </m:r>
         </m:oMath>
       </m:oMathPara>
@@ -2608,13 +2552,7 @@
             <w:rPr>
               <w:rFonts w:ascii="Cambria Math" w:hAnsi="Cambria Math" w:cstheme="minorHAnsi"/>
             </w:rPr>
-            <m:t xml:space="preserve"> =  5,17</m:t>
-          </m:r>
-          <m:r>
-            <w:rPr>
-              <w:rFonts w:ascii="Cambria Math" w:hAnsi="Cambria Math" w:cstheme="minorHAnsi"/>
-            </w:rPr>
-            <m:t xml:space="preserve"> mA</m:t>
+            <m:t xml:space="preserve"> =  5,17 mA</m:t>
           </m:r>
         </m:oMath>
       </m:oMathPara>
@@ -4850,54 +4788,6 @@
           <w:rFonts w:asciiTheme="minorHAnsi" w:hAnsiTheme="minorHAnsi" w:cstheme="minorHAnsi"/>
         </w:rPr>
       </w:pPr>
-      <w:r>
-        <w:rPr>
-          <w:rFonts w:asciiTheme="minorHAnsi" w:hAnsiTheme="minorHAnsi" w:cstheme="minorHAnsi"/>
-        </w:rPr>
-        <w:tab/>
-      </w:r>
-      <w:r>
-        <w:rPr>
-          <w:rFonts w:asciiTheme="minorHAnsi" w:hAnsiTheme="minorHAnsi" w:cstheme="minorHAnsi"/>
-        </w:rPr>
-        <w:tab/>
-      </w:r>
-      <w:r>
-        <w:rPr>
-          <w:rFonts w:asciiTheme="minorHAnsi" w:hAnsiTheme="minorHAnsi" w:cstheme="minorHAnsi"/>
-        </w:rPr>
-        <w:tab/>
-      </w:r>
-      <w:r>
-        <w:rPr>
-          <w:rFonts w:asciiTheme="minorHAnsi" w:hAnsiTheme="minorHAnsi" w:cstheme="minorHAnsi"/>
-        </w:rPr>
-        <w:tab/>
-        <w:t xml:space="preserve">wartość międzyszczytową </w:t>
-      </w:r>
-      <w:r>
-        <w:rPr>
-          <w:rFonts w:asciiTheme="minorHAnsi" w:hAnsiTheme="minorHAnsi" w:cstheme="minorHAnsi"/>
-          <w:i/>
-          <w:iCs/>
-        </w:rPr>
-        <w:t>E</w:t>
-      </w:r>
-      <w:r>
-        <w:rPr>
-          <w:rFonts w:asciiTheme="minorHAnsi" w:hAnsiTheme="minorHAnsi" w:cstheme="minorHAnsi"/>
-          <w:i/>
-          <w:iCs/>
-          <w:vertAlign w:val="subscript"/>
-        </w:rPr>
-        <w:t>g</w:t>
-      </w:r>
-      <w:r>
-        <w:rPr>
-          <w:rFonts w:asciiTheme="minorHAnsi" w:hAnsiTheme="minorHAnsi" w:cstheme="minorHAnsi"/>
-        </w:rPr>
-        <w:t> = 10 mV.</w:t>
-      </w:r>
     </w:p>
     <w:p>
       <w:pPr>
@@ -5235,19 +5125,7 @@
             <w:rPr>
               <w:rFonts w:ascii="Cambria Math" w:hAnsi="Cambria Math"/>
             </w:rPr>
-            <m:t>≈-</m:t>
-          </m:r>
-          <m:r>
-            <w:rPr>
-              <w:rFonts w:ascii="Cambria Math" w:hAnsi="Cambria Math"/>
-            </w:rPr>
-            <m:t>2,19</m:t>
-          </m:r>
-          <m:r>
-            <w:rPr>
-              <w:rFonts w:ascii="Cambria Math" w:hAnsi="Cambria Math"/>
-            </w:rPr>
-            <m:t xml:space="preserve"> V</m:t>
+            <m:t>≈-2,19 V</m:t>
           </m:r>
         </m:oMath>
       </m:oMathPara>
@@ -5388,19 +5266,7 @@
             <w:rPr>
               <w:rFonts w:ascii="Cambria Math" w:hAnsi="Cambria Math"/>
             </w:rPr>
-            <m:t>=-2</m:t>
-          </m:r>
-          <m:r>
-            <w:rPr>
-              <w:rFonts w:ascii="Cambria Math" w:hAnsi="Cambria Math"/>
-            </w:rPr>
-            <m:t>,19</m:t>
-          </m:r>
-          <m:r>
-            <w:rPr>
-              <w:rFonts w:ascii="Cambria Math" w:hAnsi="Cambria Math"/>
-            </w:rPr>
-            <m:t xml:space="preserve"> V-</m:t>
+            <m:t>=-2,19 V-</m:t>
           </m:r>
           <m:d>
             <m:dPr>
@@ -5425,13 +5291,7 @@
             <w:rPr>
               <w:rFonts w:ascii="Cambria Math" w:hAnsi="Cambria Math"/>
             </w:rPr>
-            <m:t>=0,84</m:t>
-          </m:r>
-          <m:r>
-            <w:rPr>
-              <w:rFonts w:ascii="Cambria Math" w:hAnsi="Cambria Math"/>
-            </w:rPr>
-            <m:t xml:space="preserve"> V</m:t>
+            <m:t>=0,84 V</m:t>
           </m:r>
         </m:oMath>
       </m:oMathPara>
@@ -5593,13 +5453,7 @@
             <w:rPr>
               <w:rFonts w:ascii="Cambria Math" w:hAnsi="Cambria Math"/>
             </w:rPr>
-            <m:t xml:space="preserve"> ∙</m:t>
-          </m:r>
-          <m:r>
-            <w:rPr>
-              <w:rFonts w:ascii="Cambria Math" w:hAnsi="Cambria Math"/>
-            </w:rPr>
-            <m:t xml:space="preserve"> </m:t>
+            <m:t xml:space="preserve"> ∙ </m:t>
           </m:r>
           <m:sSub>
             <m:sSubPr>
@@ -5665,67 +5519,7 @@
             <w:rPr>
               <w:rFonts w:ascii="Cambria Math" w:hAnsi="Cambria Math"/>
             </w:rPr>
-            <m:t xml:space="preserve"> = 5,17</m:t>
-          </m:r>
-          <m:r>
-            <w:rPr>
-              <w:rFonts w:ascii="Cambria Math" w:hAnsi="Cambria Math"/>
-            </w:rPr>
-            <m:t xml:space="preserve"> mA</m:t>
-          </m:r>
-          <m:r>
-            <w:rPr>
-              <w:rFonts w:ascii="Cambria Math" w:hAnsi="Cambria Math"/>
-            </w:rPr>
-            <m:t xml:space="preserve"> ∙ 1,3</m:t>
-          </m:r>
-          <m:r>
-            <w:rPr>
-              <w:rFonts w:ascii="Cambria Math" w:hAnsi="Cambria Math"/>
-            </w:rPr>
-            <m:t>0</m:t>
-          </m:r>
-          <m:r>
-            <w:rPr>
-              <w:rFonts w:ascii="Cambria Math" w:hAnsi="Cambria Math"/>
-            </w:rPr>
-            <m:t xml:space="preserve"> kΩ</m:t>
-          </m:r>
-          <m:r>
-            <w:rPr>
-              <w:rFonts w:ascii="Cambria Math" w:hAnsi="Cambria Math"/>
-            </w:rPr>
-            <m:t>||20</m:t>
-          </m:r>
-          <m:r>
-            <w:rPr>
-              <w:rFonts w:ascii="Cambria Math" w:hAnsi="Cambria Math"/>
-            </w:rPr>
-            <m:t>0</m:t>
-          </m:r>
-          <m:r>
-            <w:rPr>
-              <w:rFonts w:ascii="Cambria Math" w:hAnsi="Cambria Math"/>
-            </w:rPr>
-            <m:t>,00</m:t>
-          </m:r>
-          <m:r>
-            <w:rPr>
-              <w:rFonts w:ascii="Cambria Math" w:hAnsi="Cambria Math"/>
-            </w:rPr>
-            <m:t xml:space="preserve"> Ω</m:t>
-          </m:r>
-          <m:r>
-            <w:rPr>
-              <w:rFonts w:ascii="Cambria Math" w:hAnsi="Cambria Math"/>
-            </w:rPr>
-            <m:t xml:space="preserve"> = 0,90</m:t>
-          </m:r>
-          <m:r>
-            <w:rPr>
-              <w:rFonts w:ascii="Cambria Math" w:hAnsi="Cambria Math"/>
-            </w:rPr>
-            <m:t xml:space="preserve"> V</m:t>
+            <m:t xml:space="preserve"> = 5,17 mA ∙ 1,30 kΩ||200,00 Ω = 0,90 V</m:t>
           </m:r>
         </m:oMath>
       </m:oMathPara>
@@ -5747,17 +5541,13 @@
           <w:rFonts w:ascii="Calibri" w:hAnsi="Calibri"/>
           <w:i/>
           <w:iCs/>
-          <w:highlight w:val="yellow"/>
-        </w:rPr>
-      </w:pPr>
-      <w:bookmarkStart w:id="0" w:name="_GoBack"/>
-      <w:bookmarkEnd w:id="0"/>
-      <w:r>
-        <w:rPr>
-          <w:rFonts w:ascii="Calibri" w:hAnsi="Calibri"/>
-          <w:i/>
-          <w:iCs/>
-          <w:highlight w:val="yellow"/>
+        </w:rPr>
+      </w:pPr>
+      <w:r>
+        <w:rPr>
+          <w:rFonts w:ascii="Calibri" w:hAnsi="Calibri"/>
+          <w:i/>
+          <w:iCs/>
         </w:rPr>
         <w:t>Wartość oczekiwana</w:t>
       </w:r>
@@ -5766,7 +5556,6 @@
           <w:rFonts w:ascii="Calibri" w:hAnsi="Calibri"/>
           <w:i/>
           <w:iCs/>
-          <w:highlight w:val="yellow"/>
         </w:rPr>
         <w:t xml:space="preserve"> różni się od wartości praktycznej o</w:t>
       </w:r>
@@ -5774,7 +5563,6 @@
         <m:r>
           <w:rPr>
             <w:rFonts w:ascii="Cambria Math" w:hAnsi="Cambria Math"/>
-            <w:highlight w:val="yellow"/>
           </w:rPr>
           <m:t xml:space="preserve"> ~</m:t>
         </m:r>
@@ -5784,7 +5572,6 @@
           <w:rFonts w:ascii="Calibri" w:hAnsi="Calibri"/>
           <w:i/>
           <w:iCs/>
-          <w:highlight w:val="yellow"/>
         </w:rPr>
         <w:t>6</w:t>
       </w:r>
@@ -5793,7 +5580,6 @@
           <w:rFonts w:ascii="Calibri" w:hAnsi="Calibri"/>
           <w:i/>
           <w:iCs/>
-          <w:highlight w:val="yellow"/>
         </w:rPr>
         <w:t>%.</w:t>
       </w:r>
@@ -5802,7 +5588,6 @@
           <w:rFonts w:ascii="Calibri" w:hAnsi="Calibri"/>
           <w:i/>
           <w:iCs/>
-          <w:highlight w:val="yellow"/>
         </w:rPr>
         <w:t xml:space="preserve"> </w:t>
       </w:r>
@@ -5811,7 +5596,6 @@
           <w:rFonts w:ascii="Calibri" w:hAnsi="Calibri"/>
           <w:i/>
           <w:iCs/>
-          <w:highlight w:val="yellow"/>
         </w:rPr>
         <w:t>Najprawdopodobniej wynika to z różnicy pomiędzy zmierz</w:t>
       </w:r>
@@ -5820,7 +5604,6 @@
           <w:rFonts w:ascii="Calibri" w:hAnsi="Calibri"/>
           <w:i/>
           <w:iCs/>
-          <w:highlight w:val="yellow"/>
         </w:rPr>
         <w:t xml:space="preserve">onym a teoretycznie wyznaczonym </w:t>
       </w:r>
@@ -5829,45 +5612,103 @@
           <w:rFonts w:ascii="Calibri" w:hAnsi="Calibri"/>
           <w:i/>
           <w:iCs/>
-          <w:highlight w:val="yellow"/>
-        </w:rPr>
-        <w:t>punktem pracy.</w:t>
-      </w:r>
-    </w:p>
-    <w:p>
-      <w:pPr>
-        <w:pStyle w:val="Standard"/>
-        <w:rPr>
-          <w:rFonts w:ascii="Calibri" w:hAnsi="Calibri"/>
-          <w:i/>
-          <w:iCs/>
-          <w:highlight w:val="yellow"/>
-        </w:rPr>
-      </w:pPr>
-      <w:r>
-        <w:rPr>
-          <w:rFonts w:ascii="Calibri" w:hAnsi="Calibri"/>
-          <w:i/>
-          <w:iCs/>
-          <w:highlight w:val="yellow"/>
-        </w:rPr>
-        <w:t>Aby zwiększyć</w:t>
-      </w:r>
-      <w:r>
-        <w:rPr>
-          <w:rFonts w:ascii="Calibri" w:hAnsi="Calibri"/>
-          <w:i/>
-          <w:iCs/>
-          <w:highlight w:val="yellow"/>
-        </w:rPr>
-        <w:t xml:space="preserve"> maksymalną amplitudę sygnału wyjściowego</w:t>
-      </w:r>
-      <w:r>
-        <w:rPr>
-          <w:rFonts w:ascii="Calibri" w:hAnsi="Calibri"/>
-          <w:i/>
-          <w:iCs/>
-          <w:highlight w:val="yellow"/>
+        </w:rPr>
+        <w:t>punktem pracy</w:t>
+      </w:r>
+      <w:r>
+        <w:rPr>
+          <w:rFonts w:ascii="Calibri" w:hAnsi="Calibri"/>
+          <w:i/>
+          <w:iCs/>
+        </w:rPr>
+        <w:t>, gdyż nawet 1% blędu U</w:t>
+      </w:r>
+      <w:r>
+        <w:rPr>
+          <w:rFonts w:ascii="Calibri" w:hAnsi="Calibri"/>
+          <w:i/>
+          <w:iCs/>
+          <w:vertAlign w:val="subscript"/>
+        </w:rPr>
+        <w:t xml:space="preserve">E </w:t>
+      </w:r>
+      <w:r>
+        <w:rPr>
+          <w:rFonts w:ascii="Calibri" w:hAnsi="Calibri"/>
+          <w:i/>
+          <w:iCs/>
+        </w:rPr>
+        <w:t xml:space="preserve">zmienia wartość </w:t>
+      </w:r>
+      <m:oMath>
+        <m:sSub>
+          <m:sSubPr>
+            <m:ctrlPr>
+              <w:rPr>
+                <w:rFonts w:ascii="Cambria Math" w:hAnsi="Cambria Math"/>
+                <w:i/>
+                <w:iCs/>
+              </w:rPr>
+            </m:ctrlPr>
+          </m:sSubPr>
+          <m:e>
+            <m:r>
+              <w:rPr>
+                <w:rFonts w:ascii="Cambria Math" w:hAnsi="Cambria Math"/>
+              </w:rPr>
+              <m:t>U</m:t>
+            </m:r>
+          </m:e>
+          <m:sub>
+            <m:r>
+              <w:rPr>
+                <w:rFonts w:ascii="Cambria Math" w:hAnsi="Cambria Math"/>
+                <w:vertAlign w:val="subscript"/>
+              </w:rPr>
+              <m:t>OmaxBJT</m:t>
+            </m:r>
+          </m:sub>
+        </m:sSub>
+      </m:oMath>
+      <w:r>
+        <w:rPr>
+          <w:rFonts w:ascii="Calibri" w:hAnsi="Calibri"/>
+          <w:i/>
+          <w:iCs/>
+        </w:rPr>
+        <w:t xml:space="preserve"> o 2,62%</w:t>
+      </w:r>
+      <w:r>
+        <w:rPr>
+          <w:rFonts w:ascii="Calibri" w:hAnsi="Calibri"/>
+          <w:i/>
+          <w:iCs/>
+        </w:rPr>
+        <w:t>.</w:t>
+      </w:r>
+    </w:p>
+    <w:p>
+      <w:pPr>
+        <w:pStyle w:val="Standard"/>
+        <w:rPr>
+          <w:rFonts w:ascii="Calibri" w:hAnsi="Calibri"/>
+          <w:i/>
+          <w:iCs/>
+        </w:rPr>
+      </w:pPr>
+      <w:r>
+        <w:rPr>
+          <w:rFonts w:ascii="Calibri" w:hAnsi="Calibri"/>
+          <w:i/>
+          <w:iCs/>
+        </w:rPr>
+        <w:t>Aby zwiększyć maksymalną amplitudę sygnału wyjściowego</w:t>
+      </w:r>
+      <w:r>
+        <w:rPr>
+          <w:rFonts w:ascii="Calibri" w:hAnsi="Calibri"/>
+          <w:i/>
+          <w:iCs/>
         </w:rPr>
         <w:t xml:space="preserve"> trzeba zmniejszyć</w:t>
       </w:r>
@@ -5876,7 +5717,6 @@
           <w:rFonts w:ascii="Calibri" w:hAnsi="Calibri"/>
           <w:i/>
           <w:iCs/>
-          <w:highlight w:val="yellow"/>
         </w:rPr>
         <w:t xml:space="preserve"> rezystor R4 pilnując,</w:t>
       </w:r>
@@ -5895,7 +5735,6 @@
           <w:rFonts w:ascii="Calibri" w:hAnsi="Calibri"/>
           <w:i/>
           <w:iCs/>
-          <w:highlight w:val="yellow"/>
         </w:rPr>
         <w:t>aby tranzystor nie wyszedł ze stanu aktywnego.</w:t>
       </w:r>
@@ -5907,14 +5746,6 @@
           <w:rFonts w:ascii="Calibri" w:hAnsi="Calibri"/>
           <w:i/>
           <w:iCs/>
-        </w:rPr>
-      </w:pPr>
-    </w:p>
-    <w:p>
-      <w:pPr>
-        <w:pStyle w:val="Standard"/>
-        <w:rPr>
-          <w:rFonts w:ascii="Calibri" w:hAnsi="Calibri"/>
         </w:rPr>
       </w:pPr>
     </w:p>
@@ -5927,7 +5758,6 @@
           <w:bCs/>
           <w:sz w:val="28"/>
           <w:szCs w:val="28"/>
-          <w:lang w:val="ru-RU"/>
         </w:rPr>
       </w:pPr>
       <w:r>
@@ -5978,16 +5808,6 @@
         <w:pStyle w:val="Standard"/>
         <w:rPr>
           <w:rFonts w:ascii="Calibri" w:hAnsi="Calibri"/>
-          <w:i/>
-          <w:iCs/>
-        </w:rPr>
-      </w:pPr>
-    </w:p>
-    <w:p>
-      <w:pPr>
-        <w:pStyle w:val="Standard"/>
-        <w:rPr>
-          <w:rFonts w:ascii="Calibri" w:hAnsi="Calibri"/>
         </w:rPr>
       </w:pPr>
       <w:r>
@@ -5998,7 +5818,6 @@
           <w:i/>
           <w:iCs/>
         </w:rPr>
-        <w:lastRenderedPageBreak/>
         <w:t>E</w:t>
       </w:r>
       <w:r>
@@ -6076,16 +5895,241 @@
         <w:rPr>
           <w:rFonts w:ascii="Calibri" w:hAnsi="Calibri"/>
         </w:rPr>
-        <w:t>:mierzymy sygnal sonda więc bierzemy pod uwage rozdzielczosc sygnalu ale tez nie dużo zeby była an malosygnalowa</w:t>
-      </w:r>
-    </w:p>
-    <w:p>
-      <w:pPr>
-        <w:pStyle w:val="Standard"/>
-        <w:rPr>
-          <w:rFonts w:ascii="Calibri" w:hAnsi="Calibri"/>
-        </w:rPr>
-      </w:pPr>
+        <w:t>:</w:t>
+      </w:r>
+    </w:p>
+    <w:p>
+      <w:pPr>
+        <w:pStyle w:val="Standard"/>
+        <w:rPr>
+          <w:rFonts w:ascii="Calibri" w:hAnsi="Calibri"/>
+        </w:rPr>
+      </w:pPr>
+      <w:r>
+        <w:rPr>
+          <w:rFonts w:ascii="Calibri" w:hAnsi="Calibri"/>
+        </w:rPr>
+        <w:t>W</w:t>
+      </w:r>
+      <w:r>
+        <w:rPr>
+          <w:rFonts w:ascii="Calibri" w:hAnsi="Calibri"/>
+        </w:rPr>
+        <w:t>artość amplitudy sygnał</w:t>
+      </w:r>
+      <w:r>
+        <w:rPr>
+          <w:rFonts w:ascii="Calibri" w:hAnsi="Calibri"/>
+        </w:rPr>
+        <w:t xml:space="preserve">u wejściowego </w:t>
+      </w:r>
+      <w:r>
+        <w:rPr>
+          <w:rFonts w:ascii="Calibri" w:hAnsi="Calibri"/>
+          <w:i/>
+          <w:iCs/>
+        </w:rPr>
+        <w:t>E</w:t>
+      </w:r>
+      <w:r>
+        <w:rPr>
+          <w:rFonts w:ascii="Calibri" w:hAnsi="Calibri"/>
+          <w:i/>
+          <w:iCs/>
+          <w:vertAlign w:val="subscript"/>
+        </w:rPr>
+        <w:t>g</w:t>
+      </w:r>
+      <w:r>
+        <w:rPr>
+          <w:rFonts w:ascii="Calibri" w:hAnsi="Calibri"/>
+        </w:rPr>
+        <w:t xml:space="preserve"> </w:t>
+      </w:r>
+      <w:r>
+        <w:rPr>
+          <w:rFonts w:ascii="Calibri" w:hAnsi="Calibri"/>
+        </w:rPr>
+        <w:t>nie może być przyjęta taka sama jak w przypadku wzmacniacza WE, ponieważ wtórnik emiterowy charakteryzuje się wzmocnieniem napięciowym nieco mniejszym od jedności. Dodatkowo sygnał obserwowany na oscyl</w:t>
+      </w:r>
+      <w:r>
+        <w:rPr>
+          <w:rFonts w:ascii="Calibri" w:hAnsi="Calibri"/>
+        </w:rPr>
+        <w:t>oskopie jest mierzony sondą (zmniejsza sygnał</w:t>
+      </w:r>
+      <w:r>
+        <w:rPr>
+          <w:rFonts w:ascii="Calibri" w:hAnsi="Calibri"/>
+        </w:rPr>
+        <w:t xml:space="preserve"> </w:t>
+      </w:r>
+      <w:r>
+        <w:rPr>
+          <w:rFonts w:ascii="Calibri" w:hAnsi="Calibri"/>
+        </w:rPr>
+        <w:t>10-krotnie</w:t>
+      </w:r>
+      <w:r>
+        <w:rPr>
+          <w:rFonts w:ascii="Calibri" w:hAnsi="Calibri"/>
+        </w:rPr>
+        <w:t>), co powoduje jego dalsze zmniejszenie, a tym samym pogorszenie rozdzielczości pomiaru dla zbyt małych amplitud.</w:t>
+      </w:r>
+    </w:p>
+    <w:p>
+      <w:pPr>
+        <w:pStyle w:val="Standard"/>
+        <w:rPr>
+          <w:rFonts w:ascii="Calibri" w:hAnsi="Calibri"/>
+        </w:rPr>
+      </w:pPr>
+    </w:p>
+    <w:p>
+      <w:pPr>
+        <w:pStyle w:val="Standard"/>
+        <w:rPr>
+          <w:rFonts w:ascii="Calibri" w:hAnsi="Calibri"/>
+        </w:rPr>
+      </w:pPr>
+      <w:r>
+        <w:rPr>
+          <w:rFonts w:ascii="Calibri" w:hAnsi="Calibri"/>
+        </w:rPr>
+        <w:t xml:space="preserve">Z drugiej strony amplituda </w:t>
+      </w:r>
+      <w:r>
+        <w:rPr>
+          <w:rFonts w:ascii="Calibri" w:hAnsi="Calibri"/>
+          <w:i/>
+          <w:iCs/>
+        </w:rPr>
+        <w:t>E</w:t>
+      </w:r>
+      <w:r>
+        <w:rPr>
+          <w:rFonts w:ascii="Calibri" w:hAnsi="Calibri"/>
+          <w:i/>
+          <w:iCs/>
+          <w:vertAlign w:val="subscript"/>
+        </w:rPr>
+        <w:t>g</w:t>
+      </w:r>
+      <w:r>
+        <w:rPr>
+          <w:rFonts w:ascii="Calibri" w:hAnsi="Calibri"/>
+        </w:rPr>
+        <w:t xml:space="preserve"> </w:t>
+      </w:r>
+      <w:r>
+        <w:rPr>
+          <w:rFonts w:ascii="Calibri" w:hAnsi="Calibri"/>
+        </w:rPr>
+        <w:t xml:space="preserve">nie może być zbyt duża, ponieważ mogłoby to prowadzić do pojawienia się nieliniowości układu, szczególnie związanych z pracą tranzystora oraz obecnością elementów reaktywnych w obwodzie emitera. Wtórnik emiterowy, dzięki większej </w:t>
+      </w:r>
+      <w:r>
+        <w:rPr>
+          <w:rFonts w:ascii="Calibri" w:hAnsi="Calibri"/>
+        </w:rPr>
+        <w:t xml:space="preserve">rezystancji w obwodzie emitera r4 </w:t>
+      </w:r>
+      <w:r>
+        <w:rPr>
+          <w:rFonts w:ascii="Calibri" w:hAnsi="Calibri"/>
+        </w:rPr>
+        <w:t xml:space="preserve">w porównaniu do rezystancji dynamicznej złącza </w:t>
+      </w:r>
+      <w:r>
+        <w:rPr>
+          <w:rFonts w:ascii="Calibri" w:hAnsi="Calibri"/>
+        </w:rPr>
+        <w:t>r</w:t>
+      </w:r>
+      <w:r>
+        <w:rPr>
+          <w:rFonts w:ascii="Calibri" w:hAnsi="Calibri"/>
+          <w:vertAlign w:val="subscript"/>
+        </w:rPr>
+        <w:t>eb’</w:t>
+      </w:r>
+      <w:r>
+        <w:rPr>
+          <w:rFonts w:ascii="Calibri" w:hAnsi="Calibri"/>
+        </w:rPr>
+        <w:t>,</w:t>
+      </w:r>
+      <w:r>
+        <w:rPr>
+          <w:rFonts w:ascii="Calibri" w:hAnsi="Calibri"/>
+        </w:rPr>
+        <w:t xml:space="preserve"> </w:t>
+      </w:r>
+      <w:r>
+        <w:rPr>
+          <w:rFonts w:ascii="Calibri" w:hAnsi="Calibri"/>
+        </w:rPr>
+        <w:t>pozwala</w:t>
+      </w:r>
+      <w:r>
+        <w:rPr>
+          <w:rFonts w:ascii="Calibri" w:hAnsi="Calibri"/>
+        </w:rPr>
+        <w:t xml:space="preserve"> na pracę z większymi amplitudami niż wzmacniacz WE, ponieważ wpływ nieliniowej rezystancji złącza jest względnie mały.</w:t>
+      </w:r>
+    </w:p>
+    <w:p>
+      <w:pPr>
+        <w:pStyle w:val="Standard"/>
+        <w:rPr>
+          <w:rFonts w:ascii="Calibri" w:hAnsi="Calibri"/>
+        </w:rPr>
+      </w:pPr>
+    </w:p>
+    <w:p>
+      <w:pPr>
+        <w:pStyle w:val="Standard"/>
+        <w:rPr>
+          <w:rFonts w:ascii="Calibri" w:hAnsi="Calibri"/>
+        </w:rPr>
+      </w:pPr>
+      <w:r>
+        <w:rPr>
+          <w:rFonts w:ascii="Calibri" w:hAnsi="Calibri"/>
+        </w:rPr>
+        <w:t xml:space="preserve">Ostatecznie amplituda </w:t>
+      </w:r>
+      <w:r>
+        <w:rPr>
+          <w:rFonts w:ascii="Calibri" w:hAnsi="Calibri"/>
+          <w:i/>
+          <w:iCs/>
+        </w:rPr>
+        <w:t>E</w:t>
+      </w:r>
+      <w:r>
+        <w:rPr>
+          <w:rFonts w:ascii="Calibri" w:hAnsi="Calibri"/>
+          <w:i/>
+          <w:iCs/>
+          <w:vertAlign w:val="subscript"/>
+        </w:rPr>
+        <w:t>g</w:t>
+      </w:r>
+      <w:r>
+        <w:rPr>
+          <w:rFonts w:ascii="Calibri" w:hAnsi="Calibri"/>
+          <w:i/>
+          <w:iCs/>
+          <w:vertAlign w:val="subscript"/>
+        </w:rPr>
+        <w:t xml:space="preserve"> </w:t>
+      </w:r>
+      <w:r>
+        <w:rPr>
+          <w:rFonts w:ascii="Calibri" w:hAnsi="Calibri"/>
+        </w:rPr>
+        <w:t>została dobrana jako kompromis: na tyle duża, aby zapewnić dobrą dokładność pomiaru, ale jednocześnie na tyle mała, aby układ pracował w zakresie liniowym.</w:t>
+      </w:r>
     </w:p>
     <w:p>
       <w:pPr>
@@ -6129,6 +6173,18 @@
           <w:rFonts w:ascii="Calibri" w:hAnsi="Calibri"/>
         </w:rPr>
         <w:t> = </w:t>
+      </w:r>
+      <w:r>
+        <w:rPr>
+          <w:rFonts w:ascii="Calibri" w:hAnsi="Calibri"/>
+        </w:rPr>
+        <w:t>2 k</w:t>
+      </w:r>
+      <w:r>
+        <w:rPr>
+          <w:rFonts w:ascii="Calibri" w:hAnsi="Calibri" w:cs="Calibri"/>
+        </w:rPr>
+        <w:t>Ω</w:t>
       </w:r>
     </w:p>
     <w:p>
@@ -6620,6 +6676,12 @@
                 <w:rFonts w:ascii="Calibri" w:hAnsi="Calibri"/>
               </w:rPr>
             </w:pPr>
+            <w:r>
+              <w:rPr>
+                <w:rFonts w:ascii="Calibri" w:hAnsi="Calibri"/>
+              </w:rPr>
+              <w:t>16,67</w:t>
+            </w:r>
           </w:p>
         </w:tc>
         <w:tc>
@@ -6746,8 +6808,10 @@
               <w:rPr>
                 <w:rFonts w:ascii="Calibri" w:hAnsi="Calibri"/>
               </w:rPr>
-              <w:t>12</w:t>
-            </w:r>
+              <w:t>14,45</w:t>
+            </w:r>
+            <w:bookmarkStart w:id="0" w:name="_GoBack"/>
+            <w:bookmarkEnd w:id="0"/>
           </w:p>
         </w:tc>
         <w:tc>
@@ -7063,11 +7127,6 @@
     <w:p>
       <w:pPr>
         <w:pStyle w:val="Standard"/>
-        <w:rPr>
-          <w:rFonts w:ascii="Calibri" w:hAnsi="Calibri"/>
-          <w:i/>
-          <w:iCs/>
-        </w:rPr>
       </w:pPr>
       <w:r>
         <w:rPr>
@@ -7077,77 +7136,608 @@
         </w:rPr>
         <w:t>Obliczenia:</w:t>
       </w:r>
-    </w:p>
-    <w:p>
-      <w:pPr>
-        <w:pStyle w:val="Standard"/>
-        <w:rPr>
-          <w:rFonts w:ascii="Calibri" w:hAnsi="Calibri"/>
-          <w:i/>
-          <w:iCs/>
-          <w:color w:val="FF0000"/>
-          <w:sz w:val="21"/>
-          <w:szCs w:val="21"/>
-        </w:rPr>
-      </w:pPr>
-      <w:r>
-        <w:rPr>
-          <w:rFonts w:ascii="Calibri" w:hAnsi="Calibri"/>
-          <w:i/>
-          <w:iCs/>
-          <w:color w:val="FF0000"/>
-          <w:sz w:val="21"/>
-          <w:szCs w:val="21"/>
-        </w:rPr>
-        <w:t xml:space="preserve">Uwaga: za każdym razem należy zapisywać </w:t>
-      </w:r>
-      <w:r>
-        <w:rPr>
-          <w:rFonts w:ascii="Calibri" w:hAnsi="Calibri"/>
-          <w:i/>
-          <w:iCs/>
-          <w:color w:val="FF0000"/>
-          <w:sz w:val="21"/>
-          <w:szCs w:val="21"/>
-          <w:u w:val="single"/>
-        </w:rPr>
-        <w:t>wszystkie</w:t>
-      </w:r>
-      <w:r>
-        <w:rPr>
-          <w:rFonts w:ascii="Calibri" w:hAnsi="Calibri"/>
-          <w:i/>
-          <w:iCs/>
-          <w:color w:val="FF0000"/>
-          <w:sz w:val="21"/>
-          <w:szCs w:val="21"/>
-        </w:rPr>
-        <w:t xml:space="preserve"> przeprowadzane obliczenia w formacie:</w:t>
-      </w:r>
-    </w:p>
-    <w:p>
-      <w:pPr>
-        <w:pStyle w:val="Standard"/>
-        <w:rPr>
-          <w:rFonts w:ascii="Calibri" w:hAnsi="Calibri"/>
-          <w:i/>
-          <w:iCs/>
-          <w:color w:val="FF0000"/>
-          <w:sz w:val="21"/>
-          <w:szCs w:val="21"/>
-        </w:rPr>
-      </w:pPr>
-      <w:r>
-        <w:rPr>
-          <w:rFonts w:ascii="Calibri" w:hAnsi="Calibri"/>
-          <w:i/>
-          <w:iCs/>
-          <w:color w:val="FF0000"/>
-          <w:sz w:val="21"/>
-          <w:szCs w:val="21"/>
-        </w:rPr>
-        <w:t>wzór - podstawienie - wynik</w:t>
-      </w:r>
+      <w:r>
+        <w:t xml:space="preserve"> </w:t>
+      </w:r>
+    </w:p>
+    <w:p>
+      <w:pPr>
+        <w:pStyle w:val="Standard"/>
+      </w:pPr>
+      <w:r>
+        <w:t>Wtórnik obciążony</w:t>
+      </w:r>
+    </w:p>
+    <w:p>
+      <w:pPr>
+        <w:pStyle w:val="Standard"/>
+        <w:rPr>
+          <w:rFonts w:ascii="Calibri" w:hAnsi="Calibri"/>
+          <w:i/>
+          <w:iCs/>
+          <w:lang w:val="en-US"/>
+        </w:rPr>
+      </w:pPr>
+      <m:oMathPara>
+        <m:oMath>
+          <m:sSub>
+            <m:sSubPr>
+              <m:ctrlPr>
+                <w:rPr>
+                  <w:rFonts w:ascii="Cambria Math" w:hAnsi="Cambria Math"/>
+                  <w:i/>
+                  <w:iCs/>
+                </w:rPr>
+              </m:ctrlPr>
+            </m:sSubPr>
+            <m:e>
+              <m:r>
+                <w:rPr>
+                  <w:rFonts w:ascii="Cambria Math" w:hAnsi="Cambria Math"/>
+                </w:rPr>
+                <m:t>r</m:t>
+              </m:r>
+            </m:e>
+            <m:sub>
+              <m:r>
+                <w:rPr>
+                  <w:rFonts w:ascii="Cambria Math" w:hAnsi="Cambria Math"/>
+                  <w:vertAlign w:val="subscript"/>
+                </w:rPr>
+                <m:t>we1BJTt</m:t>
+              </m:r>
+            </m:sub>
+          </m:sSub>
+          <m:r>
+            <w:rPr>
+              <w:rFonts w:ascii="Cambria Math" w:hAnsi="Cambria Math"/>
+            </w:rPr>
+            <m:t>=</m:t>
+          </m:r>
+          <m:sSub>
+            <m:sSubPr>
+              <m:ctrlPr>
+                <w:rPr>
+                  <w:rFonts w:ascii="Cambria Math" w:hAnsi="Cambria Math"/>
+                </w:rPr>
+              </m:ctrlPr>
+            </m:sSubPr>
+            <m:e>
+              <m:r>
+                <m:rPr>
+                  <m:sty m:val="p"/>
+                </m:rPr>
+                <w:rPr>
+                  <w:rFonts w:ascii="Cambria Math" w:hAnsi="Cambria Math"/>
+                </w:rPr>
+                <m:t>R</m:t>
+              </m:r>
+            </m:e>
+            <m:sub>
+              <m:r>
+                <m:rPr>
+                  <m:sty m:val="p"/>
+                </m:rPr>
+                <w:rPr>
+                  <w:rFonts w:ascii="Cambria Math" w:hAnsi="Cambria Math"/>
+                </w:rPr>
+                <m:t>2</m:t>
+              </m:r>
+            </m:sub>
+          </m:sSub>
+          <m:r>
+            <m:rPr>
+              <m:sty m:val="p"/>
+            </m:rPr>
+            <w:rPr>
+              <w:rFonts w:ascii="Cambria Math" w:hAnsi="Cambria Math" w:cs="Cambria Math"/>
+            </w:rPr>
+            <m:t>||</m:t>
+          </m:r>
+          <m:r>
+            <m:rPr>
+              <m:sty m:val="p"/>
+            </m:rPr>
+            <w:rPr>
+              <w:rFonts w:ascii="Cambria Math" w:hAnsi="Cambria Math"/>
+            </w:rPr>
+            <m:t>(</m:t>
+          </m:r>
+          <m:r>
+            <m:rPr>
+              <m:sty m:val="p"/>
+            </m:rPr>
+            <w:rPr>
+              <w:rFonts w:ascii="Cambria Math" w:hAnsi="Cambria Math" w:cs="Times New Roman"/>
+            </w:rPr>
+            <m:t>β</m:t>
+          </m:r>
+          <m:r>
+            <m:rPr>
+              <m:sty m:val="p"/>
+            </m:rPr>
+            <w:rPr>
+              <w:rFonts w:ascii="Cambria Math" w:hAnsi="Cambria Math" w:cs="Cambria Math"/>
+            </w:rPr>
+            <m:t>⋅</m:t>
+          </m:r>
+          <m:d>
+            <m:dPr>
+              <m:ctrlPr>
+                <w:rPr>
+                  <w:rFonts w:ascii="Cambria Math" w:hAnsi="Cambria Math"/>
+                </w:rPr>
+              </m:ctrlPr>
+            </m:dPr>
+            <m:e>
+              <m:sSub>
+                <m:sSubPr>
+                  <m:ctrlPr>
+                    <w:rPr>
+                      <w:rFonts w:ascii="Cambria Math" w:hAnsi="Cambria Math"/>
+                    </w:rPr>
+                  </m:ctrlPr>
+                </m:sSubPr>
+                <m:e>
+                  <m:r>
+                    <m:rPr>
+                      <m:sty m:val="p"/>
+                    </m:rPr>
+                    <w:rPr>
+                      <w:rFonts w:ascii="Cambria Math" w:hAnsi="Cambria Math"/>
+                    </w:rPr>
+                    <m:t>R</m:t>
+                  </m:r>
+                </m:e>
+                <m:sub>
+                  <m:r>
+                    <m:rPr>
+                      <m:sty m:val="p"/>
+                    </m:rPr>
+                    <w:rPr>
+                      <w:rFonts w:ascii="Cambria Math" w:hAnsi="Cambria Math"/>
+                    </w:rPr>
+                    <m:t>4</m:t>
+                  </m:r>
+                </m:sub>
+              </m:sSub>
+              <m:ctrlPr>
+                <w:rPr>
+                  <w:rFonts w:ascii="Cambria Math" w:hAnsi="Cambria Math" w:cs="Cambria Math"/>
+                </w:rPr>
+              </m:ctrlPr>
+            </m:e>
+            <m:e>
+              <m:d>
+                <m:dPr>
+                  <m:begChr m:val="|"/>
+                  <m:ctrlPr>
+                    <w:rPr>
+                      <w:rFonts w:ascii="Cambria Math" w:hAnsi="Cambria Math" w:cs="Cambria Math"/>
+                    </w:rPr>
+                  </m:ctrlPr>
+                </m:dPr>
+                <m:e>
+                  <m:sSub>
+                    <m:sSubPr>
+                      <m:ctrlPr>
+                        <w:rPr>
+                          <w:rFonts w:ascii="Cambria Math" w:hAnsi="Cambria Math"/>
+                        </w:rPr>
+                      </m:ctrlPr>
+                    </m:sSubPr>
+                    <m:e>
+                      <m:r>
+                        <m:rPr>
+                          <m:sty m:val="p"/>
+                        </m:rPr>
+                        <w:rPr>
+                          <w:rFonts w:ascii="Cambria Math" w:hAnsi="Cambria Math"/>
+                        </w:rPr>
+                        <m:t>R</m:t>
+                      </m:r>
+                      <m:ctrlPr>
+                        <w:rPr>
+                          <w:rFonts w:ascii="Cambria Math" w:hAnsi="Cambria Math" w:cs="Cambria Math"/>
+                        </w:rPr>
+                      </m:ctrlPr>
+                    </m:e>
+                    <m:sub>
+                      <m:r>
+                        <m:rPr>
+                          <m:sty m:val="p"/>
+                        </m:rPr>
+                        <w:rPr>
+                          <w:rFonts w:ascii="Cambria Math" w:hAnsi="Cambria Math"/>
+                        </w:rPr>
+                        <m:t>6</m:t>
+                      </m:r>
+                    </m:sub>
+                  </m:sSub>
+                  <m:ctrlPr>
+                    <w:rPr>
+                      <w:rFonts w:ascii="Cambria Math" w:hAnsi="Cambria Math"/>
+                    </w:rPr>
+                  </m:ctrlPr>
+                </m:e>
+              </m:d>
+            </m:e>
+          </m:d>
+          <m:r>
+            <m:rPr>
+              <m:sty m:val="p"/>
+            </m:rPr>
+            <w:rPr>
+              <w:rFonts w:ascii="Cambria Math" w:hAnsi="Cambria Math"/>
+            </w:rPr>
+            <m:t>=</m:t>
+          </m:r>
+          <m:r>
+            <w:rPr>
+              <w:rFonts w:ascii="Cambria Math" w:hAnsi="Cambria Math"/>
+            </w:rPr>
+            <m:t>39,00</m:t>
+          </m:r>
+          <m:r>
+            <w:rPr>
+              <w:rFonts w:ascii="Cambria Math" w:hAnsi="Cambria Math"/>
+            </w:rPr>
+            <m:t xml:space="preserve"> </m:t>
+          </m:r>
+          <m:r>
+            <w:rPr>
+              <w:rFonts w:ascii="Cambria Math" w:hAnsi="Cambria Math"/>
+            </w:rPr>
+            <m:t>kΩ</m:t>
+          </m:r>
+          <m:r>
+            <w:rPr>
+              <w:rFonts w:ascii="Cambria Math" w:hAnsi="Cambria Math"/>
+            </w:rPr>
+            <m:t>||(132,41</m:t>
+          </m:r>
+          <m:r>
+            <m:rPr>
+              <m:sty m:val="p"/>
+            </m:rPr>
+            <w:rPr>
+              <w:rFonts w:ascii="Cambria Math" w:hAnsi="Cambria Math"/>
+            </w:rPr>
+            <m:t xml:space="preserve"> </m:t>
+          </m:r>
+          <m:f>
+            <m:fPr>
+              <m:ctrlPr>
+                <w:rPr>
+                  <w:rFonts w:ascii="Cambria Math" w:hAnsi="Cambria Math"/>
+                  <w:i/>
+                  <w:iCs/>
+                </w:rPr>
+              </m:ctrlPr>
+            </m:fPr>
+            <m:num>
+              <m:r>
+                <w:rPr>
+                  <w:rFonts w:ascii="Cambria Math" w:hAnsi="Cambria Math"/>
+                </w:rPr>
+                <m:t>A</m:t>
+              </m:r>
+            </m:num>
+            <m:den>
+              <m:r>
+                <w:rPr>
+                  <w:rFonts w:ascii="Cambria Math" w:hAnsi="Cambria Math"/>
+                </w:rPr>
+                <m:t>A</m:t>
+              </m:r>
+            </m:den>
+          </m:f>
+          <m:r>
+            <w:rPr>
+              <w:rFonts w:ascii="Cambria Math" w:hAnsi="Cambria Math"/>
+            </w:rPr>
+            <m:t>∙</m:t>
+          </m:r>
+          <m:d>
+            <m:dPr>
+              <m:ctrlPr>
+                <w:rPr>
+                  <w:rFonts w:ascii="Cambria Math" w:hAnsi="Cambria Math"/>
+                  <w:i/>
+                  <w:iCs/>
+                </w:rPr>
+              </m:ctrlPr>
+            </m:dPr>
+            <m:e>
+              <m:r>
+                <w:rPr>
+                  <w:rFonts w:ascii="Cambria Math" w:hAnsi="Cambria Math"/>
+                </w:rPr>
+                <m:t>200,00</m:t>
+              </m:r>
+              <m:r>
+                <w:rPr>
+                  <w:rFonts w:ascii="Cambria Math" w:hAnsi="Cambria Math"/>
+                </w:rPr>
+                <m:t xml:space="preserve"> Ω||</m:t>
+              </m:r>
+              <m:r>
+                <w:rPr>
+                  <w:rFonts w:ascii="Cambria Math" w:hAnsi="Cambria Math"/>
+                </w:rPr>
+                <m:t>1,30</m:t>
+              </m:r>
+              <m:r>
+                <w:rPr>
+                  <w:rFonts w:ascii="Cambria Math" w:hAnsi="Cambria Math"/>
+                </w:rPr>
+                <m:t xml:space="preserve"> </m:t>
+              </m:r>
+              <m:r>
+                <w:rPr>
+                  <w:rFonts w:ascii="Cambria Math" w:hAnsi="Cambria Math"/>
+                </w:rPr>
+                <m:t>kΩ</m:t>
+              </m:r>
+            </m:e>
+          </m:d>
+          <m:r>
+            <w:rPr>
+              <w:rFonts w:ascii="Cambria Math" w:hAnsi="Cambria Math"/>
+            </w:rPr>
+            <m:t>)</m:t>
+          </m:r>
+          <m:r>
+            <w:rPr>
+              <w:rFonts w:ascii="Cambria Math" w:hAnsi="Cambria Math"/>
+            </w:rPr>
+            <m:t xml:space="preserve">= </m:t>
+          </m:r>
+          <m:r>
+            <w:rPr>
+              <w:rFonts w:ascii="Cambria Math" w:hAnsi="Cambria Math"/>
+            </w:rPr>
+            <m:t xml:space="preserve">14,45 </m:t>
+          </m:r>
+          <m:r>
+            <w:rPr>
+              <w:rFonts w:ascii="Cambria Math" w:hAnsi="Cambria Math"/>
+              <w:lang w:val="en-US"/>
+            </w:rPr>
+            <m:t>kΩ</m:t>
+          </m:r>
+        </m:oMath>
+      </m:oMathPara>
+    </w:p>
+    <w:p>
+      <w:pPr>
+        <w:pStyle w:val="Standard"/>
+        <w:rPr>
+          <w:rFonts w:ascii="Calibri" w:hAnsi="Calibri"/>
+          <w:i/>
+          <w:iCs/>
+        </w:rPr>
+      </w:pPr>
+      <m:oMathPara>
+        <m:oMath>
+          <m:sSub>
+            <m:sSubPr>
+              <m:ctrlPr>
+                <w:rPr>
+                  <w:rFonts w:ascii="Cambria Math" w:hAnsi="Cambria Math"/>
+                  <w:i/>
+                  <w:iCs/>
+                </w:rPr>
+              </m:ctrlPr>
+            </m:sSubPr>
+            <m:e>
+              <m:r>
+                <w:rPr>
+                  <w:rFonts w:ascii="Cambria Math" w:hAnsi="Cambria Math"/>
+                </w:rPr>
+                <m:t>r</m:t>
+              </m:r>
+            </m:e>
+            <m:sub>
+              <m:r>
+                <w:rPr>
+                  <w:rFonts w:ascii="Cambria Math" w:hAnsi="Cambria Math"/>
+                  <w:vertAlign w:val="subscript"/>
+                </w:rPr>
+                <m:t>we1BJTp</m:t>
+              </m:r>
+            </m:sub>
+          </m:sSub>
+          <m:r>
+            <w:rPr>
+              <w:rFonts w:ascii="Cambria Math" w:hAnsi="Cambria Math"/>
+            </w:rPr>
+            <m:t>=</m:t>
+          </m:r>
+          <m:r>
+            <w:rPr>
+              <w:rFonts w:ascii="Cambria Math" w:hAnsi="Cambria Math"/>
+            </w:rPr>
+            <m:t>RG</m:t>
+          </m:r>
+          <m:d>
+            <m:dPr>
+              <m:ctrlPr>
+                <w:rPr>
+                  <w:rFonts w:ascii="Cambria Math" w:hAnsi="Cambria Math"/>
+                  <w:i/>
+                  <w:iCs/>
+                </w:rPr>
+              </m:ctrlPr>
+            </m:dPr>
+            <m:e>
+              <m:r>
+                <w:rPr>
+                  <w:rFonts w:ascii="Cambria Math" w:hAnsi="Cambria Math"/>
+                </w:rPr>
+                <m:t>1</m:t>
+              </m:r>
+            </m:e>
+          </m:d>
+          <m:r>
+            <w:rPr>
+              <w:rFonts w:ascii="Cambria Math" w:hAnsi="Cambria Math"/>
+            </w:rPr>
+            <m:t>∙</m:t>
+          </m:r>
+          <m:f>
+            <m:fPr>
+              <m:ctrlPr>
+                <w:rPr>
+                  <w:rFonts w:ascii="Cambria Math" w:hAnsi="Cambria Math"/>
+                  <w:i/>
+                  <w:iCs/>
+                </w:rPr>
+              </m:ctrlPr>
+            </m:fPr>
+            <m:num>
+              <m:sSub>
+                <m:sSubPr>
+                  <m:ctrlPr>
+                    <w:rPr>
+                      <w:rFonts w:ascii="Cambria Math" w:hAnsi="Cambria Math"/>
+                      <w:i/>
+                      <w:iCs/>
+                    </w:rPr>
+                  </m:ctrlPr>
+                </m:sSubPr>
+                <m:e>
+                  <m:r>
+                    <w:rPr>
+                      <w:rFonts w:ascii="Cambria Math" w:hAnsi="Cambria Math"/>
+                    </w:rPr>
+                    <m:t>U</m:t>
+                  </m:r>
+                </m:e>
+                <m:sub>
+                  <m:r>
+                    <w:rPr>
+                      <w:rFonts w:ascii="Cambria Math" w:hAnsi="Cambria Math"/>
+                    </w:rPr>
+                    <m:t>b</m:t>
+                  </m:r>
+                </m:sub>
+              </m:sSub>
+            </m:num>
+            <m:den>
+              <m:sSub>
+                <m:sSubPr>
+                  <m:ctrlPr>
+                    <w:rPr>
+                      <w:rFonts w:ascii="Cambria Math" w:hAnsi="Cambria Math"/>
+                      <w:i/>
+                      <w:iCs/>
+                    </w:rPr>
+                  </m:ctrlPr>
+                </m:sSubPr>
+                <m:e>
+                  <m:sSub>
+                    <m:sSubPr>
+                      <m:ctrlPr>
+                        <w:rPr>
+                          <w:rFonts w:ascii="Cambria Math" w:hAnsi="Cambria Math"/>
+                          <w:i/>
+                          <w:iCs/>
+                        </w:rPr>
+                      </m:ctrlPr>
+                    </m:sSubPr>
+                    <m:e>
+                      <m:r>
+                        <w:rPr>
+                          <w:rFonts w:ascii="Cambria Math" w:hAnsi="Cambria Math"/>
+                        </w:rPr>
+                        <m:t>E</m:t>
+                      </m:r>
+                    </m:e>
+                    <m:sub>
+                      <m:r>
+                        <w:rPr>
+                          <w:rFonts w:ascii="Cambria Math" w:hAnsi="Cambria Math"/>
+                        </w:rPr>
+                        <m:t>g</m:t>
+                      </m:r>
+                    </m:sub>
+                  </m:sSub>
+                  <m:r>
+                    <w:rPr>
+                      <w:rFonts w:ascii="Cambria Math" w:hAnsi="Cambria Math"/>
+                    </w:rPr>
+                    <m:t>-U</m:t>
+                  </m:r>
+                </m:e>
+                <m:sub>
+                  <m:r>
+                    <w:rPr>
+                      <w:rFonts w:ascii="Cambria Math" w:hAnsi="Cambria Math"/>
+                    </w:rPr>
+                    <m:t>b</m:t>
+                  </m:r>
+                </m:sub>
+              </m:sSub>
+            </m:den>
+          </m:f>
+          <m:r>
+            <w:rPr>
+              <w:rFonts w:ascii="Cambria Math" w:hAnsi="Cambria Math"/>
+            </w:rPr>
+            <m:t>=2kΩ∙</m:t>
+          </m:r>
+          <m:f>
+            <m:fPr>
+              <m:ctrlPr>
+                <w:rPr>
+                  <w:rFonts w:ascii="Cambria Math" w:hAnsi="Cambria Math"/>
+                  <w:i/>
+                  <w:iCs/>
+                </w:rPr>
+              </m:ctrlPr>
+            </m:fPr>
+            <m:num>
+              <m:r>
+                <w:rPr>
+                  <w:rFonts w:ascii="Cambria Math" w:hAnsi="Cambria Math"/>
+                </w:rPr>
+                <m:t>446,43mV</m:t>
+              </m:r>
+            </m:num>
+            <m:den>
+              <m:r>
+                <w:rPr>
+                  <w:rFonts w:ascii="Cambria Math" w:hAnsi="Cambria Math"/>
+                </w:rPr>
+                <m:t>500,00mV-</m:t>
+              </m:r>
+              <m:r>
+                <w:rPr>
+                  <w:rFonts w:ascii="Cambria Math" w:hAnsi="Cambria Math"/>
+                </w:rPr>
+                <m:t>446,43mV</m:t>
+              </m:r>
+            </m:den>
+          </m:f>
+          <m:r>
+            <w:rPr>
+              <w:rFonts w:ascii="Cambria Math" w:hAnsi="Cambria Math"/>
+            </w:rPr>
+            <m:t>=16,67kΩ</m:t>
+          </m:r>
+        </m:oMath>
+      </m:oMathPara>
+    </w:p>
+    <w:p>
+      <w:pPr>
+        <w:pStyle w:val="Standard"/>
+        <w:rPr>
+          <w:rFonts w:ascii="Calibri" w:hAnsi="Calibri"/>
+          <w:i/>
+          <w:iCs/>
+        </w:rPr>
+      </w:pPr>
     </w:p>
     <w:p>
       <w:pPr>
@@ -7166,6 +7756,7 @@
           <w:noProof/>
           <w:lang w:val="ru-RU" w:eastAsia="ru-RU" w:bidi="ar-SA"/>
         </w:rPr>
+        <w:lastRenderedPageBreak/>
         <w:drawing>
           <wp:anchor distT="0" distB="0" distL="114300" distR="114300" simplePos="0" relativeHeight="2" behindDoc="0" locked="0" layoutInCell="1" allowOverlap="1">
             <wp:simplePos x="0" y="0"/>
@@ -7265,7 +7856,6 @@
           <w:i/>
           <w:iCs/>
         </w:rPr>
-        <w:lastRenderedPageBreak/>
         <w:t xml:space="preserve">bez R6 </w:t>
       </w:r>
       <w:r>
@@ -8439,7 +9029,6 @@
           <w:noProof/>
           <w:lang w:val="ru-RU" w:eastAsia="ru-RU" w:bidi="ar-SA"/>
         </w:rPr>
-        <w:lastRenderedPageBreak/>
         <w:drawing>
           <wp:anchor distT="0" distB="0" distL="114300" distR="114300" simplePos="0" relativeHeight="4" behindDoc="0" locked="0" layoutInCell="1" allowOverlap="1">
             <wp:simplePos x="0" y="0"/>
@@ -8507,6 +9096,7 @@
           <w:noProof/>
           <w:lang w:val="ru-RU" w:eastAsia="ru-RU" w:bidi="ar-SA"/>
         </w:rPr>
+        <w:lastRenderedPageBreak/>
         <w:drawing>
           <wp:anchor distT="0" distB="0" distL="114300" distR="114300" simplePos="0" relativeHeight="5" behindDoc="0" locked="0" layoutInCell="1" allowOverlap="1">
             <wp:simplePos x="0" y="0"/>
@@ -8684,7 +9274,6 @@
           <w:i/>
           <w:iCs/>
         </w:rPr>
-        <w:lastRenderedPageBreak/>
         <w:t>R2</w:t>
       </w:r>
       <w:r>
@@ -9200,6 +9789,7 @@
           <w:noProof/>
           <w:lang w:val="ru-RU" w:eastAsia="ru-RU" w:bidi="ar-SA"/>
         </w:rPr>
+        <w:lastRenderedPageBreak/>
         <w:drawing>
           <wp:anchor distT="0" distB="0" distL="114300" distR="114300" simplePos="0" relativeHeight="7" behindDoc="0" locked="0" layoutInCell="1" allowOverlap="1">
             <wp:simplePos x="0" y="0"/>
@@ -9344,7 +9934,6 @@
         <w:rPr>
           <w:rFonts w:ascii="Calibri" w:hAnsi="Calibri"/>
         </w:rPr>
-        <w:lastRenderedPageBreak/>
         <w:t>Maksymalna amplituda nieobciętego sygnału:</w:t>
       </w:r>
       <w:r>
@@ -9412,6 +10001,7 @@
           <w:noProof/>
           <w:lang w:val="ru-RU" w:eastAsia="ru-RU" w:bidi="ar-SA"/>
         </w:rPr>
+        <w:lastRenderedPageBreak/>
         <w:drawing>
           <wp:anchor distT="0" distB="0" distL="114300" distR="114300" simplePos="0" relativeHeight="21" behindDoc="0" locked="0" layoutInCell="1" allowOverlap="1">
             <wp:simplePos x="0" y="0"/>

</xml_diff>